<commit_message>
POS menu qty: hide zero placeholders in Data View and DOCX.
- Harden normalize_pos_menu_qty_cell (NFKC, zero-width chars).
- build_match_index uses same normalization; Jinja pos_qty_cell filter.
- Deferred Data View JS mirrors server rules; menu preview qty aligned.
- helpers: import normalize_pos_menu_qty_cell for Label POS merge field.

Co-authored-by: Cursor <cursoragent@cursor.com>
</commit_message>
<xml_diff>
--- a/templates/documents/InventorySlips.docx
+++ b/templates/documents/InventorySlips.docx
@@ -266,109 +266,79 @@
                       <w:rFonts w:ascii="Arial" w:hAnsi="Arial" w:cs="Arial"/>
                       <w:b/>
                       <w:bCs/>
+                      <w:sz w:val="18"/>
+                      <w:szCs w:val="18"/>
+                    </w:rPr>
+                    <w:t xml:space="preserve">Old </w:t>
+                  </w:r>
+                  <w:r>
+                    <w:rPr>
+                      <w:rFonts w:ascii="Arial" w:hAnsi="Arial" w:cs="Arial"/>
+                      <w:b/>
+                      <w:bCs/>
+                      <w:sz w:val="18"/>
+                      <w:szCs w:val="18"/>
+                    </w:rPr>
+                    <w:t xml:space="preserve">Units </w:t>
+                  </w:r>
+                </w:p>
+                <w:p>
+                  <w:pPr>
+                    <w:shd w:val="clear" w:color="auto" w:fill="E8E8E8" w:themeFill="background2"/>
+                    <w:ind w:right="126"/>
+                    <w:rPr>
+                      <w:rFonts w:ascii="Arial" w:hAnsi="Arial" w:cs="Arial"/>
+                      <w:sz w:val="18"/>
+                      <w:szCs w:val="18"/>
+                    </w:rPr>
+                  </w:pPr>
+                  <w:r>
+                    <w:rPr>
+                      <w:rFonts w:ascii="Arial" w:hAnsi="Arial" w:cs="Arial"/>
+                      <w:b/>
+                      <w:bCs/>
+                      <w:sz w:val="18"/>
+                      <w:szCs w:val="18"/>
+                    </w:rPr>
+                    <w:t>Remaining:</w:t>
+                  </w:r>
+                  <w:proofErr w:type="gramStart"/>
+                  <w:r>
+                    <w:rPr>
+                      <w:rFonts w:ascii="Arial" w:hAnsi="Arial" w:cs="Arial"/>
                       <w:noProof/>
                       <w:sz w:val="18"/>
                       <w:szCs w:val="18"/>
                     </w:rPr>
-                    <mc:AlternateContent>
-                      <mc:Choice Requires="wps">
-                        <w:drawing>
-                          <wp:anchor distT="0" distB="0" distL="114300" distR="114300" simplePos="0" relativeHeight="251686912" behindDoc="0" locked="0" layoutInCell="1" allowOverlap="1" wp14:anchorId="5C5F1AFC" wp14:editId="258E496A">
-                            <wp:simplePos x="0" y="0"/>
-                            <wp:positionH relativeFrom="column">
-                              <wp:posOffset>665723</wp:posOffset>
-                            </wp:positionH>
-                            <wp:positionV relativeFrom="paragraph">
-                              <wp:posOffset>26279</wp:posOffset>
-                            </wp:positionV>
-                            <wp:extent cx="262011" cy="252486"/>
-                            <wp:effectExtent l="0" t="0" r="17780" b="14605"/>
-                            <wp:wrapNone/>
-                            <wp:docPr id="1200732041" name="Rectangle 1"/>
-                            <wp:cNvGraphicFramePr/>
-                            <a:graphic xmlns:a="http://schemas.openxmlformats.org/drawingml/2006/main">
-                              <a:graphicData uri="http://schemas.microsoft.com/office/word/2010/wordprocessingShape">
-                                <wps:wsp>
-                                  <wps:cNvSpPr/>
-                                  <wps:spPr>
-                                    <a:xfrm>
-                                      <a:off x="0" y="0"/>
-                                      <a:ext cx="262011" cy="252486"/>
-                                    </a:xfrm>
-                                    <a:prstGeom prst="rect">
-                                      <a:avLst/>
-                                    </a:prstGeom>
-                                  </wps:spPr>
-                                  <wps:style>
-                                    <a:lnRef idx="2">
-                                      <a:schemeClr val="accent6"/>
-                                    </a:lnRef>
-                                    <a:fillRef idx="1">
-                                      <a:schemeClr val="lt1"/>
-                                    </a:fillRef>
-                                    <a:effectRef idx="0">
-                                      <a:schemeClr val="accent6"/>
-                                    </a:effectRef>
-                                    <a:fontRef idx="minor">
-                                      <a:schemeClr val="dk1"/>
-                                    </a:fontRef>
-                                  </wps:style>
-                                  <wps:bodyPr rot="0" spcFirstLastPara="0" vertOverflow="overflow" horzOverflow="overflow" vert="horz" wrap="square" lIns="91440" tIns="45720" rIns="91440" bIns="45720" numCol="1" spcCol="0" rtlCol="0" fromWordArt="0" anchor="ctr" anchorCtr="0" forceAA="0" compatLnSpc="1">
-                                    <a:prstTxWarp prst="textNoShape">
-                                      <a:avLst/>
-                                    </a:prstTxWarp>
-                                    <a:noAutofit/>
-                                  </wps:bodyPr>
-                                </wps:wsp>
-                              </a:graphicData>
-                            </a:graphic>
-                            <wp14:sizeRelH relativeFrom="margin">
-                              <wp14:pctWidth>0</wp14:pctWidth>
-                            </wp14:sizeRelH>
-                            <wp14:sizeRelV relativeFrom="margin">
-                              <wp14:pctHeight>0</wp14:pctHeight>
-                            </wp14:sizeRelV>
-                          </wp:anchor>
-                        </w:drawing>
-                      </mc:Choice>
-                      <mc:Fallback>
-                        <w:pict>
-                          <v:rect w14:anchorId="4928B800" id="Rectangle 1" o:spid="_x0000_s1026" style="position:absolute;margin-left:52.4pt;margin-top:2.05pt;width:20.65pt;height:19.9pt;z-index:251686912;visibility:visible;mso-wrap-style:square;mso-width-percent:0;mso-height-percent:0;mso-wrap-distance-left:9pt;mso-wrap-distance-top:0;mso-wrap-distance-right:9pt;mso-wrap-distance-bottom:0;mso-position-horizontal:absolute;mso-position-horizontal-relative:text;mso-position-vertical:absolute;mso-position-vertical-relative:text;mso-width-percent:0;mso-height-percent:0;mso-width-relative:margin;mso-height-relative:margin;v-text-anchor:middle" o:gfxdata="UEsDBBQABgAIAAAAIQC2gziS/gAAAOEBAAATAAAAW0NvbnRlbnRfVHlwZXNdLnhtbJSRQU7DMBBF&#13;&#10;90jcwfIWJU67QAgl6YK0S0CoHGBkTxKLZGx5TGhvj5O2G0SRWNoz/78nu9wcxkFMGNg6quQqL6RA&#13;&#10;0s5Y6ir5vt9lD1JwBDIwOMJKHpHlpr69KfdHjyxSmriSfYz+USnWPY7AufNIadK6MEJMx9ApD/oD&#13;&#10;OlTrorhX2lFEilmcO2RdNtjC5xDF9pCuTyYBB5bi6bQ4syoJ3g9WQ0ymaiLzg5KdCXlKLjvcW893&#13;&#10;SUOqXwnz5DrgnHtJTxOsQfEKIT7DmDSUCaxw7Rqn8787ZsmRM9e2VmPeBN4uqYvTtW7jvijg9N/y&#13;&#10;JsXecLq0q+WD6m8AAAD//wMAUEsDBBQABgAIAAAAIQA4/SH/1gAAAJQBAAALAAAAX3JlbHMvLnJl&#13;&#10;bHOkkMFqwzAMhu+DvYPRfXGawxijTi+j0GvpHsDYimMaW0Yy2fr2M4PBMnrbUb/Q94l/f/hMi1qR&#13;&#10;JVI2sOt6UJgd+ZiDgffL8ekFlFSbvV0oo4EbChzGx4f9GRdb25HMsYhqlCwG5lrLq9biZkxWOiqY&#13;&#10;22YiTra2kYMu1l1tQD30/bPm3wwYN0x18gb45AdQl1tp5j/sFB2T0FQ7R0nTNEV3j6o9feQzro1i&#13;&#10;OWA14Fm+Q8a1a8+Bvu/d/dMb2JY5uiPbhG/ktn4cqGU/er3pcvwCAAD//wMAUEsDBBQABgAIAAAA&#13;&#10;IQADMDmKRwIAAOsEAAAOAAAAZHJzL2Uyb0RvYy54bWysVE1vGjEQvVfqf7B8LwuI0BSxRIgoVSWU&#13;&#10;RCFVzsZrw6pejzs2LPTXd+xdFppyqnoxY8+8+Xj7hundoTJsr9CXYHM+6PU5U1ZCUdpNzr+/Pny6&#13;&#10;5cwHYQthwKqcH5Xnd7OPH6a1m6ghbMEUChklsX5Su5xvQ3CTLPNyqyrhe+CUJacGrESgK26yAkVN&#13;&#10;2SuTDfv9cVYDFg5BKu/p9b5x8lnKr7WS4UlrrwIzOafeQjoxnet4ZrOpmGxQuG0p2zbEP3RRidJS&#13;&#10;0S7VvQiC7bD8K1VVSgQPOvQkVBloXUqVZqBpBv1306y2wqk0C5HjXUeT/39p5eN+5Z6RaKidn3gy&#13;&#10;4xQHjVX8pf7YIZF17MhSh8AkPQ7H1PGAM0mu4c1wdDuOZGZnsEMfviqoWDRyjvQtEkViv/ShCT2F&#13;&#10;EO5cPlnhaFTswNgXpVlZxIIJnZShFgbZXtA3FVIqG06lU3SE6dKYDji4BjRh0PbbxkaYSorpgP1r&#13;&#10;wD8rdohUFWzowFVpAa8lKH50lZv40/TNzHH8NRTHZ2QIjV69kw8lkbgUPjwLJIGSlGnpwhMd2kCd&#13;&#10;c2gtzraAv669x3jSDXk5q0nwOfc/dwIVZ+abJUV9GYxGcUPSZXTzeUgXvPSsLz12Vy2A+CcBUHfJ&#13;&#10;jPHBnEyNUL3Rbs5jVXIJK6l2zmXA02URmkWk7ZZqPk9htBVOhKVdORmTR1ajSF4PbwJdq6RAEnyE&#13;&#10;03KIyTtBNbERaWG+C6DLpLYzry3ftFFJr+32x5W9vKeo83/U7DcAAAD//wMAUEsDBBQABgAIAAAA&#13;&#10;IQDGnnCu3wAAAA0BAAAPAAAAZHJzL2Rvd25yZXYueG1sTI/NTsNADITvSLzDykjc6CY0qmiaTVWo&#13;&#10;Clcof1c3a5KIrDfKbtrw9rgnuFgejTz+plhPrlNHGkLr2UA6S0ARV962XBt4e93d3IEKEdli55kM&#13;&#10;/FCAdXl5UWBu/Ylf6LiPtZIQDjkaaGLsc61D1ZDDMPM9sXhffnAYRQ61tgOeJNx1+jZJFtphy/Kh&#13;&#10;wZ4eGqq+96MzMFaP9591v3ne7ub8pH26dO8f1pjrq2m7krFZgYo0xb8LOHcQfigF7OBHtkF1opNM&#13;&#10;+KOBLAV19rOFLAfR8yXostD/W5S/AAAA//8DAFBLAQItABQABgAIAAAAIQC2gziS/gAAAOEBAAAT&#13;&#10;AAAAAAAAAAAAAAAAAAAAAABbQ29udGVudF9UeXBlc10ueG1sUEsBAi0AFAAGAAgAAAAhADj9If/W&#13;&#10;AAAAlAEAAAsAAAAAAAAAAAAAAAAALwEAAF9yZWxzLy5yZWxzUEsBAi0AFAAGAAgAAAAhAAMwOYpH&#13;&#10;AgAA6wQAAA4AAAAAAAAAAAAAAAAALgIAAGRycy9lMm9Eb2MueG1sUEsBAi0AFAAGAAgAAAAhAMae&#13;&#10;cK7fAAAADQEAAA8AAAAAAAAAAAAAAAAAoQQAAGRycy9kb3ducmV2LnhtbFBLBQYAAAAABAAEAPMA&#13;&#10;AACtBQAAAAA=&#13;&#10;" fillcolor="white [3201]" strokecolor="#4ea72e [3209]" strokeweight="1pt"/>
-                        </w:pict>
-                      </mc:Fallback>
-                    </mc:AlternateContent>
-                  </w:r>
-                  <w:r>
-                    <w:rPr>
-                      <w:rFonts w:ascii="Arial" w:hAnsi="Arial" w:cs="Arial"/>
-                      <w:b/>
-                      <w:bCs/>
+                    <w:t xml:space="preserve"> </w:t>
+                  </w:r>
+                  <w:r>
+                    <w:rPr>
+                      <w:rFonts w:ascii="Arial" w:hAnsi="Arial" w:cs="Arial"/>
                       <w:sz w:val="18"/>
                       <w:szCs w:val="18"/>
                     </w:rPr>
-                    <w:t xml:space="preserve">Old </w:t>
-                  </w:r>
-                  <w:r>
-                    <w:rPr>
-                      <w:rFonts w:ascii="Arial" w:hAnsi="Arial" w:cs="Arial"/>
-                      <w:b/>
-                      <w:bCs/>
+                    <w:t xml:space="preserve"> </w:t>
+                  </w:r>
+                  <w:r>
+                    <w:rPr>
+                      <w:rFonts w:ascii="Arial" w:hAnsi="Arial" w:cs="Arial"/>
                       <w:sz w:val="18"/>
                       <w:szCs w:val="18"/>
                     </w:rPr>
-                    <w:t xml:space="preserve">Units </w:t>
-                  </w:r>
-                </w:p>
-                <w:p>
-                  <w:pPr>
-                    <w:shd w:val="clear" w:color="auto" w:fill="E8E8E8" w:themeFill="background2"/>
-                    <w:ind w:right="126"/>
-                    <w:rPr>
-                      <w:rFonts w:ascii="Arial" w:hAnsi="Arial" w:cs="Arial"/>
+                    <w:t xml:space="preserve"> </w:t>
+                  </w:r>
+                  <w:r>
+                    <w:rPr>
+                      <w:rFonts w:ascii="Arial" w:hAnsi="Arial" w:cs="Arial"/>
+                      <w:b/>
+                      <w:bCs/>
                       <w:sz w:val="18"/>
                       <w:szCs w:val="18"/>
                     </w:rPr>
-                  </w:pPr>
+                    <w:t>{</w:t>
+                  </w:r>
+                  <w:proofErr w:type="gramEnd"/>
                   <w:r>
                     <w:rPr>
                       <w:rFonts w:ascii="Arial" w:hAnsi="Arial" w:cs="Arial"/>
@@ -377,24 +347,27 @@
                       <w:sz w:val="18"/>
                       <w:szCs w:val="18"/>
                     </w:rPr>
-                    <w:t>Remaining:</w:t>
-                  </w:r>
-                  <w:r>
-                    <w:rPr>
-                      <w:rFonts w:ascii="Arial" w:hAnsi="Arial" w:cs="Arial"/>
-                      <w:noProof/>
+                    <w:t>{Label1.</w:t>
+                  </w:r>
+                  <w:r>
+                    <w:rPr>
+                      <w:rFonts w:ascii="Arial" w:hAnsi="Arial" w:cs="Arial"/>
+                      <w:b/>
+                      <w:bCs/>
                       <w:sz w:val="18"/>
                       <w:szCs w:val="18"/>
                     </w:rPr>
-                    <w:t xml:space="preserve"> </w:t>
-                  </w:r>
-                  <w:r>
-                    <w:rPr>
-                      <w:rFonts w:ascii="Arial" w:hAnsi="Arial" w:cs="Arial"/>
+                    <w:t>POS</w:t>
+                  </w:r>
+                  <w:r>
+                    <w:rPr>
+                      <w:rFonts w:ascii="Arial" w:hAnsi="Arial" w:cs="Arial"/>
+                      <w:b/>
+                      <w:bCs/>
                       <w:sz w:val="18"/>
                       <w:szCs w:val="18"/>
                     </w:rPr>
-                    <w:t xml:space="preserve"> </w:t>
+                    <w:t>}}</w:t>
                   </w:r>
                   <w:r>
                     <w:rPr>
@@ -402,14 +375,6 @@
                       <w:sz w:val="18"/>
                       <w:szCs w:val="18"/>
                     </w:rPr>
-                    <w:t xml:space="preserve"> </w:t>
-                  </w:r>
-                  <w:r>
-                    <w:rPr>
-                      <w:rFonts w:ascii="Arial" w:hAnsi="Arial" w:cs="Arial"/>
-                      <w:sz w:val="18"/>
-                      <w:szCs w:val="18"/>
-                    </w:rPr>
                     <w:br/>
                   </w:r>
                   <w:r>
@@ -430,17 +395,7 @@
                       <w:sz w:val="10"/>
                       <w:szCs w:val="10"/>
                     </w:rPr>
-                    <w:t>(</w:t>
-                  </w:r>
-                  <w:r>
-                    <w:rPr>
-                      <w:rFonts w:ascii="Arial" w:hAnsi="Arial" w:cs="Arial"/>
-                      <w:i/>
-                      <w:iCs/>
-                      <w:sz w:val="10"/>
-                      <w:szCs w:val="10"/>
-                    </w:rPr>
-                    <w:t xml:space="preserve">All employees must check </w:t>
+                    <w:t xml:space="preserve">(All employees must check </w:t>
                   </w:r>
                   <w:r>
                     <w:rPr>
@@ -2951,109 +2906,79 @@
                       <w:rFonts w:ascii="Arial" w:hAnsi="Arial" w:cs="Arial"/>
                       <w:b/>
                       <w:bCs/>
+                      <w:sz w:val="18"/>
+                      <w:szCs w:val="18"/>
+                    </w:rPr>
+                    <w:t xml:space="preserve">Old </w:t>
+                  </w:r>
+                  <w:r>
+                    <w:rPr>
+                      <w:rFonts w:ascii="Arial" w:hAnsi="Arial" w:cs="Arial"/>
+                      <w:b/>
+                      <w:bCs/>
+                      <w:sz w:val="18"/>
+                      <w:szCs w:val="18"/>
+                    </w:rPr>
+                    <w:t xml:space="preserve">Units </w:t>
+                  </w:r>
+                </w:p>
+                <w:p>
+                  <w:pPr>
+                    <w:shd w:val="clear" w:color="auto" w:fill="E8E8E8" w:themeFill="background2"/>
+                    <w:ind w:right="126"/>
+                    <w:rPr>
+                      <w:rFonts w:ascii="Arial" w:hAnsi="Arial" w:cs="Arial"/>
+                      <w:sz w:val="18"/>
+                      <w:szCs w:val="18"/>
+                    </w:rPr>
+                  </w:pPr>
+                  <w:r>
+                    <w:rPr>
+                      <w:rFonts w:ascii="Arial" w:hAnsi="Arial" w:cs="Arial"/>
+                      <w:b/>
+                      <w:bCs/>
+                      <w:sz w:val="18"/>
+                      <w:szCs w:val="18"/>
+                    </w:rPr>
+                    <w:t>Remaining:</w:t>
+                  </w:r>
+                  <w:proofErr w:type="gramStart"/>
+                  <w:r>
+                    <w:rPr>
+                      <w:rFonts w:ascii="Arial" w:hAnsi="Arial" w:cs="Arial"/>
                       <w:noProof/>
                       <w:sz w:val="18"/>
                       <w:szCs w:val="18"/>
                     </w:rPr>
-                    <mc:AlternateContent>
-                      <mc:Choice Requires="wps">
-                        <w:drawing>
-                          <wp:anchor distT="0" distB="0" distL="114300" distR="114300" simplePos="0" relativeHeight="251708416" behindDoc="0" locked="0" layoutInCell="1" allowOverlap="1" wp14:anchorId="1B3F6B31" wp14:editId="6B000267">
-                            <wp:simplePos x="0" y="0"/>
-                            <wp:positionH relativeFrom="column">
-                              <wp:posOffset>665723</wp:posOffset>
-                            </wp:positionH>
-                            <wp:positionV relativeFrom="paragraph">
-                              <wp:posOffset>26279</wp:posOffset>
-                            </wp:positionV>
-                            <wp:extent cx="262011" cy="252486"/>
-                            <wp:effectExtent l="0" t="0" r="17780" b="14605"/>
-                            <wp:wrapNone/>
-                            <wp:docPr id="1477200954" name="Rectangle 1"/>
-                            <wp:cNvGraphicFramePr/>
-                            <a:graphic xmlns:a="http://schemas.openxmlformats.org/drawingml/2006/main">
-                              <a:graphicData uri="http://schemas.microsoft.com/office/word/2010/wordprocessingShape">
-                                <wps:wsp>
-                                  <wps:cNvSpPr/>
-                                  <wps:spPr>
-                                    <a:xfrm>
-                                      <a:off x="0" y="0"/>
-                                      <a:ext cx="262011" cy="252486"/>
-                                    </a:xfrm>
-                                    <a:prstGeom prst="rect">
-                                      <a:avLst/>
-                                    </a:prstGeom>
-                                  </wps:spPr>
-                                  <wps:style>
-                                    <a:lnRef idx="2">
-                                      <a:schemeClr val="accent6"/>
-                                    </a:lnRef>
-                                    <a:fillRef idx="1">
-                                      <a:schemeClr val="lt1"/>
-                                    </a:fillRef>
-                                    <a:effectRef idx="0">
-                                      <a:schemeClr val="accent6"/>
-                                    </a:effectRef>
-                                    <a:fontRef idx="minor">
-                                      <a:schemeClr val="dk1"/>
-                                    </a:fontRef>
-                                  </wps:style>
-                                  <wps:bodyPr rot="0" spcFirstLastPara="0" vertOverflow="overflow" horzOverflow="overflow" vert="horz" wrap="square" lIns="91440" tIns="45720" rIns="91440" bIns="45720" numCol="1" spcCol="0" rtlCol="0" fromWordArt="0" anchor="ctr" anchorCtr="0" forceAA="0" compatLnSpc="1">
-                                    <a:prstTxWarp prst="textNoShape">
-                                      <a:avLst/>
-                                    </a:prstTxWarp>
-                                    <a:noAutofit/>
-                                  </wps:bodyPr>
-                                </wps:wsp>
-                              </a:graphicData>
-                            </a:graphic>
-                            <wp14:sizeRelH relativeFrom="margin">
-                              <wp14:pctWidth>0</wp14:pctWidth>
-                            </wp14:sizeRelH>
-                            <wp14:sizeRelV relativeFrom="margin">
-                              <wp14:pctHeight>0</wp14:pctHeight>
-                            </wp14:sizeRelV>
-                          </wp:anchor>
-                        </w:drawing>
-                      </mc:Choice>
-                      <mc:Fallback>
-                        <w:pict>
-                          <v:rect w14:anchorId="0F9D7D4F" id="Rectangle 1" o:spid="_x0000_s1026" style="position:absolute;margin-left:52.4pt;margin-top:2.05pt;width:20.65pt;height:19.9pt;z-index:251708416;visibility:visible;mso-wrap-style:square;mso-width-percent:0;mso-height-percent:0;mso-wrap-distance-left:9pt;mso-wrap-distance-top:0;mso-wrap-distance-right:9pt;mso-wrap-distance-bottom:0;mso-position-horizontal:absolute;mso-position-horizontal-relative:text;mso-position-vertical:absolute;mso-position-vertical-relative:text;mso-width-percent:0;mso-height-percent:0;mso-width-relative:margin;mso-height-relative:margin;v-text-anchor:middle" o:gfxdata="UEsDBBQABgAIAAAAIQC2gziS/gAAAOEBAAATAAAAW0NvbnRlbnRfVHlwZXNdLnhtbJSRQU7DMBBF&#13;&#10;90jcwfIWJU67QAgl6YK0S0CoHGBkTxKLZGx5TGhvj5O2G0SRWNoz/78nu9wcxkFMGNg6quQqL6RA&#13;&#10;0s5Y6ir5vt9lD1JwBDIwOMJKHpHlpr69KfdHjyxSmriSfYz+USnWPY7AufNIadK6MEJMx9ApD/oD&#13;&#10;OlTrorhX2lFEilmcO2RdNtjC5xDF9pCuTyYBB5bi6bQ4syoJ3g9WQ0ymaiLzg5KdCXlKLjvcW893&#13;&#10;SUOqXwnz5DrgnHtJTxOsQfEKIT7DmDSUCaxw7Rqn8787ZsmRM9e2VmPeBN4uqYvTtW7jvijg9N/y&#13;&#10;JsXecLq0q+WD6m8AAAD//wMAUEsDBBQABgAIAAAAIQA4/SH/1gAAAJQBAAALAAAAX3JlbHMvLnJl&#13;&#10;bHOkkMFqwzAMhu+DvYPRfXGawxijTi+j0GvpHsDYimMaW0Yy2fr2M4PBMnrbUb/Q94l/f/hMi1qR&#13;&#10;JVI2sOt6UJgd+ZiDgffL8ekFlFSbvV0oo4EbChzGx4f9GRdb25HMsYhqlCwG5lrLq9biZkxWOiqY&#13;&#10;22YiTra2kYMu1l1tQD30/bPm3wwYN0x18gb45AdQl1tp5j/sFB2T0FQ7R0nTNEV3j6o9feQzro1i&#13;&#10;OWA14Fm+Q8a1a8+Bvu/d/dMb2JY5uiPbhG/ktn4cqGU/er3pcvwCAAD//wMAUEsDBBQABgAIAAAA&#13;&#10;IQADMDmKRwIAAOsEAAAOAAAAZHJzL2Uyb0RvYy54bWysVE1vGjEQvVfqf7B8LwuI0BSxRIgoVSWU&#13;&#10;RCFVzsZrw6pejzs2LPTXd+xdFppyqnoxY8+8+Xj7hundoTJsr9CXYHM+6PU5U1ZCUdpNzr+/Pny6&#13;&#10;5cwHYQthwKqcH5Xnd7OPH6a1m6ghbMEUChklsX5Su5xvQ3CTLPNyqyrhe+CUJacGrESgK26yAkVN&#13;&#10;2SuTDfv9cVYDFg5BKu/p9b5x8lnKr7WS4UlrrwIzOafeQjoxnet4ZrOpmGxQuG0p2zbEP3RRidJS&#13;&#10;0S7VvQiC7bD8K1VVSgQPOvQkVBloXUqVZqBpBv1306y2wqk0C5HjXUeT/39p5eN+5Z6RaKidn3gy&#13;&#10;4xQHjVX8pf7YIZF17MhSh8AkPQ7H1PGAM0mu4c1wdDuOZGZnsEMfviqoWDRyjvQtEkViv/ShCT2F&#13;&#10;EO5cPlnhaFTswNgXpVlZxIIJnZShFgbZXtA3FVIqG06lU3SE6dKYDji4BjRh0PbbxkaYSorpgP1r&#13;&#10;wD8rdohUFWzowFVpAa8lKH50lZv40/TNzHH8NRTHZ2QIjV69kw8lkbgUPjwLJIGSlGnpwhMd2kCd&#13;&#10;c2gtzraAv669x3jSDXk5q0nwOfc/dwIVZ+abJUV9GYxGcUPSZXTzeUgXvPSsLz12Vy2A+CcBUHfJ&#13;&#10;jPHBnEyNUL3Rbs5jVXIJK6l2zmXA02URmkWk7ZZqPk9htBVOhKVdORmTR1ajSF4PbwJdq6RAEnyE&#13;&#10;03KIyTtBNbERaWG+C6DLpLYzry3ftFFJr+32x5W9vKeo83/U7DcAAAD//wMAUEsDBBQABgAIAAAA&#13;&#10;IQDGnnCu3wAAAA0BAAAPAAAAZHJzL2Rvd25yZXYueG1sTI/NTsNADITvSLzDykjc6CY0qmiaTVWo&#13;&#10;Clcof1c3a5KIrDfKbtrw9rgnuFgejTz+plhPrlNHGkLr2UA6S0ARV962XBt4e93d3IEKEdli55kM&#13;&#10;/FCAdXl5UWBu/Ylf6LiPtZIQDjkaaGLsc61D1ZDDMPM9sXhffnAYRQ61tgOeJNx1+jZJFtphy/Kh&#13;&#10;wZ4eGqq+96MzMFaP9591v3ne7ub8pH26dO8f1pjrq2m7krFZgYo0xb8LOHcQfigF7OBHtkF1opNM&#13;&#10;+KOBLAV19rOFLAfR8yXostD/W5S/AAAA//8DAFBLAQItABQABgAIAAAAIQC2gziS/gAAAOEBAAAT&#13;&#10;AAAAAAAAAAAAAAAAAAAAAABbQ29udGVudF9UeXBlc10ueG1sUEsBAi0AFAAGAAgAAAAhADj9If/W&#13;&#10;AAAAlAEAAAsAAAAAAAAAAAAAAAAALwEAAF9yZWxzLy5yZWxzUEsBAi0AFAAGAAgAAAAhAAMwOYpH&#13;&#10;AgAA6wQAAA4AAAAAAAAAAAAAAAAALgIAAGRycy9lMm9Eb2MueG1sUEsBAi0AFAAGAAgAAAAhAMae&#13;&#10;cK7fAAAADQEAAA8AAAAAAAAAAAAAAAAAoQQAAGRycy9kb3ducmV2LnhtbFBLBQYAAAAABAAEAPMA&#13;&#10;AACtBQAAAAA=&#13;&#10;" fillcolor="white [3201]" strokecolor="#4ea72e [3209]" strokeweight="1pt"/>
-                        </w:pict>
-                      </mc:Fallback>
-                    </mc:AlternateContent>
-                  </w:r>
-                  <w:r>
-                    <w:rPr>
-                      <w:rFonts w:ascii="Arial" w:hAnsi="Arial" w:cs="Arial"/>
-                      <w:b/>
-                      <w:bCs/>
+                    <w:t xml:space="preserve"> </w:t>
+                  </w:r>
+                  <w:r>
+                    <w:rPr>
+                      <w:rFonts w:ascii="Arial" w:hAnsi="Arial" w:cs="Arial"/>
                       <w:sz w:val="18"/>
                       <w:szCs w:val="18"/>
                     </w:rPr>
-                    <w:t xml:space="preserve">Old </w:t>
-                  </w:r>
-                  <w:r>
-                    <w:rPr>
-                      <w:rFonts w:ascii="Arial" w:hAnsi="Arial" w:cs="Arial"/>
-                      <w:b/>
-                      <w:bCs/>
+                    <w:t xml:space="preserve"> </w:t>
+                  </w:r>
+                  <w:r>
+                    <w:rPr>
+                      <w:rFonts w:ascii="Arial" w:hAnsi="Arial" w:cs="Arial"/>
                       <w:sz w:val="18"/>
                       <w:szCs w:val="18"/>
                     </w:rPr>
-                    <w:t xml:space="preserve">Units </w:t>
-                  </w:r>
-                </w:p>
-                <w:p>
-                  <w:pPr>
-                    <w:shd w:val="clear" w:color="auto" w:fill="E8E8E8" w:themeFill="background2"/>
-                    <w:ind w:right="126"/>
-                    <w:rPr>
-                      <w:rFonts w:ascii="Arial" w:hAnsi="Arial" w:cs="Arial"/>
+                    <w:t xml:space="preserve"> </w:t>
+                  </w:r>
+                  <w:r>
+                    <w:rPr>
+                      <w:rFonts w:ascii="Arial" w:hAnsi="Arial" w:cs="Arial"/>
+                      <w:b/>
+                      <w:bCs/>
                       <w:sz w:val="18"/>
                       <w:szCs w:val="18"/>
                     </w:rPr>
-                  </w:pPr>
+                    <w:t>{</w:t>
+                  </w:r>
+                  <w:proofErr w:type="gramEnd"/>
                   <w:r>
                     <w:rPr>
                       <w:rFonts w:ascii="Arial" w:hAnsi="Arial" w:cs="Arial"/>
@@ -3062,32 +2987,27 @@
                       <w:sz w:val="18"/>
                       <w:szCs w:val="18"/>
                     </w:rPr>
-                    <w:t>Remaining:</w:t>
-                  </w:r>
-                  <w:r>
-                    <w:rPr>
-                      <w:rFonts w:ascii="Arial" w:hAnsi="Arial" w:cs="Arial"/>
-                      <w:noProof/>
+                    <w:t>{Label</w:t>
+                  </w:r>
+                  <w:r>
+                    <w:rPr>
+                      <w:rFonts w:ascii="Arial" w:hAnsi="Arial" w:cs="Arial"/>
+                      <w:b/>
+                      <w:bCs/>
                       <w:sz w:val="18"/>
                       <w:szCs w:val="18"/>
                     </w:rPr>
-                    <w:t xml:space="preserve"> </w:t>
-                  </w:r>
-                  <w:r>
-                    <w:rPr>
-                      <w:rFonts w:ascii="Arial" w:hAnsi="Arial" w:cs="Arial"/>
+                    <w:t>2</w:t>
+                  </w:r>
+                  <w:r>
+                    <w:rPr>
+                      <w:rFonts w:ascii="Arial" w:hAnsi="Arial" w:cs="Arial"/>
+                      <w:b/>
+                      <w:bCs/>
                       <w:sz w:val="18"/>
                       <w:szCs w:val="18"/>
                     </w:rPr>
-                    <w:t xml:space="preserve"> </w:t>
-                  </w:r>
-                  <w:r>
-                    <w:rPr>
-                      <w:rFonts w:ascii="Arial" w:hAnsi="Arial" w:cs="Arial"/>
-                      <w:sz w:val="18"/>
-                      <w:szCs w:val="18"/>
-                    </w:rPr>
-                    <w:t xml:space="preserve"> </w:t>
+                    <w:t>.POS}}</w:t>
                   </w:r>
                   <w:r>
                     <w:rPr>
@@ -3415,27 +3335,7 @@
                       <w:sz w:val="16"/>
                       <w:szCs w:val="16"/>
                     </w:rPr>
-                    <w:t>{{Label</w:t>
-                  </w:r>
-                  <w:r>
-                    <w:rPr>
-                      <w:rFonts w:ascii="Arial" w:hAnsi="Arial" w:cs="Arial"/>
-                      <w:b/>
-                      <w:bCs/>
-                      <w:sz w:val="16"/>
-                      <w:szCs w:val="16"/>
-                    </w:rPr>
-                    <w:t>2</w:t>
-                  </w:r>
-                  <w:r>
-                    <w:rPr>
-                      <w:rFonts w:ascii="Arial" w:hAnsi="Arial" w:cs="Arial"/>
-                      <w:b/>
-                      <w:bCs/>
-                      <w:sz w:val="16"/>
-                      <w:szCs w:val="16"/>
-                    </w:rPr>
-                    <w:t>.QuantityReceived}}</w:t>
+                    <w:t>{{Label2.QuantityReceived}}</w:t>
                   </w:r>
                 </w:p>
                 <w:p>
@@ -5648,77 +5548,10 @@
                       <w:rFonts w:ascii="Arial" w:hAnsi="Arial" w:cs="Arial"/>
                       <w:b/>
                       <w:bCs/>
-                      <w:noProof/>
                       <w:sz w:val="18"/>
                       <w:szCs w:val="18"/>
                     </w:rPr>
-                    <mc:AlternateContent>
-                      <mc:Choice Requires="wps">
-                        <w:drawing>
-                          <wp:anchor distT="0" distB="0" distL="114300" distR="114300" simplePos="0" relativeHeight="251711488" behindDoc="0" locked="0" layoutInCell="1" allowOverlap="1" wp14:anchorId="0AD2461A" wp14:editId="3FD818D4">
-                            <wp:simplePos x="0" y="0"/>
-                            <wp:positionH relativeFrom="column">
-                              <wp:posOffset>665723</wp:posOffset>
-                            </wp:positionH>
-                            <wp:positionV relativeFrom="paragraph">
-                              <wp:posOffset>26279</wp:posOffset>
-                            </wp:positionV>
-                            <wp:extent cx="262011" cy="252486"/>
-                            <wp:effectExtent l="0" t="0" r="17780" b="14605"/>
-                            <wp:wrapNone/>
-                            <wp:docPr id="2000579283" name="Rectangle 1"/>
-                            <wp:cNvGraphicFramePr/>
-                            <a:graphic xmlns:a="http://schemas.openxmlformats.org/drawingml/2006/main">
-                              <a:graphicData uri="http://schemas.microsoft.com/office/word/2010/wordprocessingShape">
-                                <wps:wsp>
-                                  <wps:cNvSpPr/>
-                                  <wps:spPr>
-                                    <a:xfrm>
-                                      <a:off x="0" y="0"/>
-                                      <a:ext cx="262011" cy="252486"/>
-                                    </a:xfrm>
-                                    <a:prstGeom prst="rect">
-                                      <a:avLst/>
-                                    </a:prstGeom>
-                                  </wps:spPr>
-                                  <wps:style>
-                                    <a:lnRef idx="2">
-                                      <a:schemeClr val="accent6"/>
-                                    </a:lnRef>
-                                    <a:fillRef idx="1">
-                                      <a:schemeClr val="lt1"/>
-                                    </a:fillRef>
-                                    <a:effectRef idx="0">
-                                      <a:schemeClr val="accent6"/>
-                                    </a:effectRef>
-                                    <a:fontRef idx="minor">
-                                      <a:schemeClr val="dk1"/>
-                                    </a:fontRef>
-                                  </wps:style>
-                                  <wps:bodyPr rot="0" spcFirstLastPara="0" vertOverflow="overflow" horzOverflow="overflow" vert="horz" wrap="square" lIns="91440" tIns="45720" rIns="91440" bIns="45720" numCol="1" spcCol="0" rtlCol="0" fromWordArt="0" anchor="ctr" anchorCtr="0" forceAA="0" compatLnSpc="1">
-                                    <a:prstTxWarp prst="textNoShape">
-                                      <a:avLst/>
-                                    </a:prstTxWarp>
-                                    <a:noAutofit/>
-                                  </wps:bodyPr>
-                                </wps:wsp>
-                              </a:graphicData>
-                            </a:graphic>
-                            <wp14:sizeRelH relativeFrom="margin">
-                              <wp14:pctWidth>0</wp14:pctWidth>
-                            </wp14:sizeRelH>
-                            <wp14:sizeRelV relativeFrom="margin">
-                              <wp14:pctHeight>0</wp14:pctHeight>
-                            </wp14:sizeRelV>
-                          </wp:anchor>
-                        </w:drawing>
-                      </mc:Choice>
-                      <mc:Fallback>
-                        <w:pict>
-                          <v:rect w14:anchorId="4E37516F" id="Rectangle 1" o:spid="_x0000_s1026" style="position:absolute;margin-left:52.4pt;margin-top:2.05pt;width:20.65pt;height:19.9pt;z-index:251711488;visibility:visible;mso-wrap-style:square;mso-width-percent:0;mso-height-percent:0;mso-wrap-distance-left:9pt;mso-wrap-distance-top:0;mso-wrap-distance-right:9pt;mso-wrap-distance-bottom:0;mso-position-horizontal:absolute;mso-position-horizontal-relative:text;mso-position-vertical:absolute;mso-position-vertical-relative:text;mso-width-percent:0;mso-height-percent:0;mso-width-relative:margin;mso-height-relative:margin;v-text-anchor:middle" o:gfxdata="UEsDBBQABgAIAAAAIQC2gziS/gAAAOEBAAATAAAAW0NvbnRlbnRfVHlwZXNdLnhtbJSRQU7DMBBF&#13;&#10;90jcwfIWJU67QAgl6YK0S0CoHGBkTxKLZGx5TGhvj5O2G0SRWNoz/78nu9wcxkFMGNg6quQqL6RA&#13;&#10;0s5Y6ir5vt9lD1JwBDIwOMJKHpHlpr69KfdHjyxSmriSfYz+USnWPY7AufNIadK6MEJMx9ApD/oD&#13;&#10;OlTrorhX2lFEilmcO2RdNtjC5xDF9pCuTyYBB5bi6bQ4syoJ3g9WQ0ymaiLzg5KdCXlKLjvcW893&#13;&#10;SUOqXwnz5DrgnHtJTxOsQfEKIT7DmDSUCaxw7Rqn8787ZsmRM9e2VmPeBN4uqYvTtW7jvijg9N/y&#13;&#10;JsXecLq0q+WD6m8AAAD//wMAUEsDBBQABgAIAAAAIQA4/SH/1gAAAJQBAAALAAAAX3JlbHMvLnJl&#13;&#10;bHOkkMFqwzAMhu+DvYPRfXGawxijTi+j0GvpHsDYimMaW0Yy2fr2M4PBMnrbUb/Q94l/f/hMi1qR&#13;&#10;JVI2sOt6UJgd+ZiDgffL8ekFlFSbvV0oo4EbChzGx4f9GRdb25HMsYhqlCwG5lrLq9biZkxWOiqY&#13;&#10;22YiTra2kYMu1l1tQD30/bPm3wwYN0x18gb45AdQl1tp5j/sFB2T0FQ7R0nTNEV3j6o9feQzro1i&#13;&#10;OWA14Fm+Q8a1a8+Bvu/d/dMb2JY5uiPbhG/ktn4cqGU/er3pcvwCAAD//wMAUEsDBBQABgAIAAAA&#13;&#10;IQADMDmKRwIAAOsEAAAOAAAAZHJzL2Uyb0RvYy54bWysVE1vGjEQvVfqf7B8LwuI0BSxRIgoVSWU&#13;&#10;RCFVzsZrw6pejzs2LPTXd+xdFppyqnoxY8+8+Xj7hundoTJsr9CXYHM+6PU5U1ZCUdpNzr+/Pny6&#13;&#10;5cwHYQthwKqcH5Xnd7OPH6a1m6ghbMEUChklsX5Su5xvQ3CTLPNyqyrhe+CUJacGrESgK26yAkVN&#13;&#10;2SuTDfv9cVYDFg5BKu/p9b5x8lnKr7WS4UlrrwIzOafeQjoxnet4ZrOpmGxQuG0p2zbEP3RRidJS&#13;&#10;0S7VvQiC7bD8K1VVSgQPOvQkVBloXUqVZqBpBv1306y2wqk0C5HjXUeT/39p5eN+5Z6RaKidn3gy&#13;&#10;4xQHjVX8pf7YIZF17MhSh8AkPQ7H1PGAM0mu4c1wdDuOZGZnsEMfviqoWDRyjvQtEkViv/ShCT2F&#13;&#10;EO5cPlnhaFTswNgXpVlZxIIJnZShFgbZXtA3FVIqG06lU3SE6dKYDji4BjRh0PbbxkaYSorpgP1r&#13;&#10;wD8rdohUFWzowFVpAa8lKH50lZv40/TNzHH8NRTHZ2QIjV69kw8lkbgUPjwLJIGSlGnpwhMd2kCd&#13;&#10;c2gtzraAv669x3jSDXk5q0nwOfc/dwIVZ+abJUV9GYxGcUPSZXTzeUgXvPSsLz12Vy2A+CcBUHfJ&#13;&#10;jPHBnEyNUL3Rbs5jVXIJK6l2zmXA02URmkWk7ZZqPk9htBVOhKVdORmTR1ajSF4PbwJdq6RAEnyE&#13;&#10;03KIyTtBNbERaWG+C6DLpLYzry3ftFFJr+32x5W9vKeo83/U7DcAAAD//wMAUEsDBBQABgAIAAAA&#13;&#10;IQDGnnCu3wAAAA0BAAAPAAAAZHJzL2Rvd25yZXYueG1sTI/NTsNADITvSLzDykjc6CY0qmiaTVWo&#13;&#10;Clcof1c3a5KIrDfKbtrw9rgnuFgejTz+plhPrlNHGkLr2UA6S0ARV962XBt4e93d3IEKEdli55kM&#13;&#10;/FCAdXl5UWBu/Ylf6LiPtZIQDjkaaGLsc61D1ZDDMPM9sXhffnAYRQ61tgOeJNx1+jZJFtphy/Kh&#13;&#10;wZ4eGqq+96MzMFaP9591v3ne7ub8pH26dO8f1pjrq2m7krFZgYo0xb8LOHcQfigF7OBHtkF1opNM&#13;&#10;+KOBLAV19rOFLAfR8yXostD/W5S/AAAA//8DAFBLAQItABQABgAIAAAAIQC2gziS/gAAAOEBAAAT&#13;&#10;AAAAAAAAAAAAAAAAAAAAAABbQ29udGVudF9UeXBlc10ueG1sUEsBAi0AFAAGAAgAAAAhADj9If/W&#13;&#10;AAAAlAEAAAsAAAAAAAAAAAAAAAAALwEAAF9yZWxzLy5yZWxzUEsBAi0AFAAGAAgAAAAhAAMwOYpH&#13;&#10;AgAA6wQAAA4AAAAAAAAAAAAAAAAALgIAAGRycy9lMm9Eb2MueG1sUEsBAi0AFAAGAAgAAAAhAMae&#13;&#10;cK7fAAAADQEAAA8AAAAAAAAAAAAAAAAAoQQAAGRycy9kb3ducmV2LnhtbFBLBQYAAAAABAAEAPMA&#13;&#10;AACtBQAAAAA=&#13;&#10;" fillcolor="white [3201]" strokecolor="#4ea72e [3209]" strokeweight="1pt"/>
-                        </w:pict>
-                      </mc:Fallback>
-                    </mc:AlternateContent>
+                    <w:t xml:space="preserve">Old </w:t>
                   </w:r>
                   <w:r>
                     <w:rPr>
@@ -5728,29 +5561,39 @@
                       <w:sz w:val="18"/>
                       <w:szCs w:val="18"/>
                     </w:rPr>
-                    <w:t xml:space="preserve">Old </w:t>
-                  </w:r>
-                  <w:r>
-                    <w:rPr>
-                      <w:rFonts w:ascii="Arial" w:hAnsi="Arial" w:cs="Arial"/>
-                      <w:b/>
-                      <w:bCs/>
+                    <w:t xml:space="preserve">Units </w:t>
+                  </w:r>
+                </w:p>
+                <w:p>
+                  <w:pPr>
+                    <w:shd w:val="clear" w:color="auto" w:fill="E8E8E8" w:themeFill="background2"/>
+                    <w:ind w:right="126"/>
+                    <w:rPr>
+                      <w:rFonts w:ascii="Arial" w:hAnsi="Arial" w:cs="Arial"/>
                       <w:sz w:val="18"/>
                       <w:szCs w:val="18"/>
                     </w:rPr>
-                    <w:t xml:space="preserve">Units </w:t>
-                  </w:r>
-                </w:p>
-                <w:p>
-                  <w:pPr>
-                    <w:shd w:val="clear" w:color="auto" w:fill="E8E8E8" w:themeFill="background2"/>
-                    <w:ind w:right="126"/>
-                    <w:rPr>
-                      <w:rFonts w:ascii="Arial" w:hAnsi="Arial" w:cs="Arial"/>
+                  </w:pPr>
+                  <w:r>
+                    <w:rPr>
+                      <w:rFonts w:ascii="Arial" w:hAnsi="Arial" w:cs="Arial"/>
+                      <w:b/>
+                      <w:bCs/>
                       <w:sz w:val="18"/>
                       <w:szCs w:val="18"/>
                     </w:rPr>
-                  </w:pPr>
+                    <w:t>Remaining:</w:t>
+                  </w:r>
+                  <w:r>
+                    <w:rPr>
+                      <w:rFonts w:ascii="Arial" w:hAnsi="Arial" w:cs="Arial"/>
+                      <w:b/>
+                      <w:bCs/>
+                      <w:sz w:val="21"/>
+                      <w:szCs w:val="21"/>
+                    </w:rPr>
+                    <w:t xml:space="preserve"> </w:t>
+                  </w:r>
                   <w:r>
                     <w:rPr>
                       <w:rFonts w:ascii="Arial" w:hAnsi="Arial" w:cs="Arial"/>
@@ -5759,33 +5602,57 @@
                       <w:sz w:val="18"/>
                       <w:szCs w:val="18"/>
                     </w:rPr>
-                    <w:t>Remaining:</w:t>
-                  </w:r>
-                  <w:r>
-                    <w:rPr>
-                      <w:rFonts w:ascii="Arial" w:hAnsi="Arial" w:cs="Arial"/>
-                      <w:noProof/>
+                    <w:t>{{Label</w:t>
+                  </w:r>
+                  <w:r>
+                    <w:rPr>
+                      <w:rFonts w:ascii="Arial" w:hAnsi="Arial" w:cs="Arial"/>
+                      <w:b/>
+                      <w:bCs/>
                       <w:sz w:val="18"/>
                       <w:szCs w:val="18"/>
                     </w:rPr>
-                    <w:t xml:space="preserve"> </w:t>
-                  </w:r>
-                  <w:r>
-                    <w:rPr>
-                      <w:rFonts w:ascii="Arial" w:hAnsi="Arial" w:cs="Arial"/>
+                    <w:t>3</w:t>
+                  </w:r>
+                  <w:r>
+                    <w:rPr>
+                      <w:rFonts w:ascii="Arial" w:hAnsi="Arial" w:cs="Arial"/>
+                      <w:b/>
+                      <w:bCs/>
                       <w:sz w:val="18"/>
                       <w:szCs w:val="18"/>
                     </w:rPr>
-                    <w:t xml:space="preserve"> </w:t>
-                  </w:r>
-                  <w:r>
-                    <w:rPr>
-                      <w:rFonts w:ascii="Arial" w:hAnsi="Arial" w:cs="Arial"/>
+                    <w:t>.POS</w:t>
+                  </w:r>
+                  <w:proofErr w:type="gramStart"/>
+                  <w:r>
+                    <w:rPr>
+                      <w:rFonts w:ascii="Arial" w:hAnsi="Arial" w:cs="Arial"/>
+                      <w:b/>
+                      <w:bCs/>
                       <w:sz w:val="18"/>
                       <w:szCs w:val="18"/>
                     </w:rPr>
+                    <w:t>}}</w:t>
+                  </w:r>
+                  <w:r>
+                    <w:rPr>
+                      <w:rFonts w:ascii="Arial" w:hAnsi="Arial" w:cs="Arial"/>
+                      <w:noProof/>
+                      <w:sz w:val="15"/>
+                      <w:szCs w:val="15"/>
+                    </w:rPr>
                     <w:t xml:space="preserve"> </w:t>
                   </w:r>
+                  <w:r>
+                    <w:rPr>
+                      <w:rFonts w:ascii="Arial" w:hAnsi="Arial" w:cs="Arial"/>
+                      <w:sz w:val="15"/>
+                      <w:szCs w:val="15"/>
+                    </w:rPr>
+                    <w:t xml:space="preserve">  </w:t>
+                  </w:r>
+                  <w:proofErr w:type="gramEnd"/>
                   <w:r>
                     <w:rPr>
                       <w:rFonts w:ascii="Arial" w:hAnsi="Arial" w:cs="Arial"/>
@@ -8345,87 +8212,58 @@
                       <w:rFonts w:ascii="Arial" w:hAnsi="Arial" w:cs="Arial"/>
                       <w:b/>
                       <w:bCs/>
+                      <w:sz w:val="18"/>
+                      <w:szCs w:val="18"/>
+                    </w:rPr>
+                    <w:t xml:space="preserve">Old </w:t>
+                  </w:r>
+                  <w:r>
+                    <w:rPr>
+                      <w:rFonts w:ascii="Arial" w:hAnsi="Arial" w:cs="Arial"/>
+                      <w:b/>
+                      <w:bCs/>
+                      <w:sz w:val="18"/>
+                      <w:szCs w:val="18"/>
+                    </w:rPr>
+                    <w:t xml:space="preserve">Units </w:t>
+                  </w:r>
+                </w:p>
+                <w:p>
+                  <w:pPr>
+                    <w:shd w:val="clear" w:color="auto" w:fill="E8E8E8" w:themeFill="background2"/>
+                    <w:ind w:right="126"/>
+                    <w:rPr>
+                      <w:rFonts w:ascii="Arial" w:hAnsi="Arial" w:cs="Arial"/>
+                      <w:sz w:val="18"/>
+                      <w:szCs w:val="18"/>
+                    </w:rPr>
+                  </w:pPr>
+                  <w:r>
+                    <w:rPr>
+                      <w:rFonts w:ascii="Arial" w:hAnsi="Arial" w:cs="Arial"/>
+                      <w:b/>
+                      <w:bCs/>
+                      <w:sz w:val="18"/>
+                      <w:szCs w:val="18"/>
+                    </w:rPr>
+                    <w:t>Remaining:</w:t>
+                  </w:r>
+                  <w:r>
+                    <w:rPr>
+                      <w:rFonts w:ascii="Arial" w:hAnsi="Arial" w:cs="Arial"/>
                       <w:noProof/>
                       <w:sz w:val="18"/>
                       <w:szCs w:val="18"/>
                     </w:rPr>
-                    <mc:AlternateContent>
-                      <mc:Choice Requires="wps">
-                        <w:drawing>
-                          <wp:anchor distT="0" distB="0" distL="114300" distR="114300" simplePos="0" relativeHeight="251714560" behindDoc="0" locked="0" layoutInCell="1" allowOverlap="1" wp14:anchorId="4A94B686" wp14:editId="462B0002">
-                            <wp:simplePos x="0" y="0"/>
-                            <wp:positionH relativeFrom="column">
-                              <wp:posOffset>665723</wp:posOffset>
-                            </wp:positionH>
-                            <wp:positionV relativeFrom="paragraph">
-                              <wp:posOffset>26279</wp:posOffset>
-                            </wp:positionV>
-                            <wp:extent cx="262011" cy="252486"/>
-                            <wp:effectExtent l="0" t="0" r="17780" b="14605"/>
-                            <wp:wrapNone/>
-                            <wp:docPr id="213564599" name="Rectangle 1"/>
-                            <wp:cNvGraphicFramePr/>
-                            <a:graphic xmlns:a="http://schemas.openxmlformats.org/drawingml/2006/main">
-                              <a:graphicData uri="http://schemas.microsoft.com/office/word/2010/wordprocessingShape">
-                                <wps:wsp>
-                                  <wps:cNvSpPr/>
-                                  <wps:spPr>
-                                    <a:xfrm>
-                                      <a:off x="0" y="0"/>
-                                      <a:ext cx="262011" cy="252486"/>
-                                    </a:xfrm>
-                                    <a:prstGeom prst="rect">
-                                      <a:avLst/>
-                                    </a:prstGeom>
-                                  </wps:spPr>
-                                  <wps:style>
-                                    <a:lnRef idx="2">
-                                      <a:schemeClr val="accent6"/>
-                                    </a:lnRef>
-                                    <a:fillRef idx="1">
-                                      <a:schemeClr val="lt1"/>
-                                    </a:fillRef>
-                                    <a:effectRef idx="0">
-                                      <a:schemeClr val="accent6"/>
-                                    </a:effectRef>
-                                    <a:fontRef idx="minor">
-                                      <a:schemeClr val="dk1"/>
-                                    </a:fontRef>
-                                  </wps:style>
-                                  <wps:bodyPr rot="0" spcFirstLastPara="0" vertOverflow="overflow" horzOverflow="overflow" vert="horz" wrap="square" lIns="91440" tIns="45720" rIns="91440" bIns="45720" numCol="1" spcCol="0" rtlCol="0" fromWordArt="0" anchor="ctr" anchorCtr="0" forceAA="0" compatLnSpc="1">
-                                    <a:prstTxWarp prst="textNoShape">
-                                      <a:avLst/>
-                                    </a:prstTxWarp>
-                                    <a:noAutofit/>
-                                  </wps:bodyPr>
-                                </wps:wsp>
-                              </a:graphicData>
-                            </a:graphic>
-                            <wp14:sizeRelH relativeFrom="margin">
-                              <wp14:pctWidth>0</wp14:pctWidth>
-                            </wp14:sizeRelH>
-                            <wp14:sizeRelV relativeFrom="margin">
-                              <wp14:pctHeight>0</wp14:pctHeight>
-                            </wp14:sizeRelV>
-                          </wp:anchor>
-                        </w:drawing>
-                      </mc:Choice>
-                      <mc:Fallback>
-                        <w:pict>
-                          <v:rect w14:anchorId="075919FC" id="Rectangle 1" o:spid="_x0000_s1026" style="position:absolute;margin-left:52.4pt;margin-top:2.05pt;width:20.65pt;height:19.9pt;z-index:251714560;visibility:visible;mso-wrap-style:square;mso-width-percent:0;mso-height-percent:0;mso-wrap-distance-left:9pt;mso-wrap-distance-top:0;mso-wrap-distance-right:9pt;mso-wrap-distance-bottom:0;mso-position-horizontal:absolute;mso-position-horizontal-relative:text;mso-position-vertical:absolute;mso-position-vertical-relative:text;mso-width-percent:0;mso-height-percent:0;mso-width-relative:margin;mso-height-relative:margin;v-text-anchor:middle" o:gfxdata="UEsDBBQABgAIAAAAIQC2gziS/gAAAOEBAAATAAAAW0NvbnRlbnRfVHlwZXNdLnhtbJSRQU7DMBBF&#13;&#10;90jcwfIWJU67QAgl6YK0S0CoHGBkTxKLZGx5TGhvj5O2G0SRWNoz/78nu9wcxkFMGNg6quQqL6RA&#13;&#10;0s5Y6ir5vt9lD1JwBDIwOMJKHpHlpr69KfdHjyxSmriSfYz+USnWPY7AufNIadK6MEJMx9ApD/oD&#13;&#10;OlTrorhX2lFEilmcO2RdNtjC5xDF9pCuTyYBB5bi6bQ4syoJ3g9WQ0ymaiLzg5KdCXlKLjvcW893&#13;&#10;SUOqXwnz5DrgnHtJTxOsQfEKIT7DmDSUCaxw7Rqn8787ZsmRM9e2VmPeBN4uqYvTtW7jvijg9N/y&#13;&#10;JsXecLq0q+WD6m8AAAD//wMAUEsDBBQABgAIAAAAIQA4/SH/1gAAAJQBAAALAAAAX3JlbHMvLnJl&#13;&#10;bHOkkMFqwzAMhu+DvYPRfXGawxijTi+j0GvpHsDYimMaW0Yy2fr2M4PBMnrbUb/Q94l/f/hMi1qR&#13;&#10;JVI2sOt6UJgd+ZiDgffL8ekFlFSbvV0oo4EbChzGx4f9GRdb25HMsYhqlCwG5lrLq9biZkxWOiqY&#13;&#10;22YiTra2kYMu1l1tQD30/bPm3wwYN0x18gb45AdQl1tp5j/sFB2T0FQ7R0nTNEV3j6o9feQzro1i&#13;&#10;OWA14Fm+Q8a1a8+Bvu/d/dMb2JY5uiPbhG/ktn4cqGU/er3pcvwCAAD//wMAUEsDBBQABgAIAAAA&#13;&#10;IQADMDmKRwIAAOsEAAAOAAAAZHJzL2Uyb0RvYy54bWysVE1vGjEQvVfqf7B8LwuI0BSxRIgoVSWU&#13;&#10;RCFVzsZrw6pejzs2LPTXd+xdFppyqnoxY8+8+Xj7hundoTJsr9CXYHM+6PU5U1ZCUdpNzr+/Pny6&#13;&#10;5cwHYQthwKqcH5Xnd7OPH6a1m6ghbMEUChklsX5Su5xvQ3CTLPNyqyrhe+CUJacGrESgK26yAkVN&#13;&#10;2SuTDfv9cVYDFg5BKu/p9b5x8lnKr7WS4UlrrwIzOafeQjoxnet4ZrOpmGxQuG0p2zbEP3RRidJS&#13;&#10;0S7VvQiC7bD8K1VVSgQPOvQkVBloXUqVZqBpBv1306y2wqk0C5HjXUeT/39p5eN+5Z6RaKidn3gy&#13;&#10;4xQHjVX8pf7YIZF17MhSh8AkPQ7H1PGAM0mu4c1wdDuOZGZnsEMfviqoWDRyjvQtEkViv/ShCT2F&#13;&#10;EO5cPlnhaFTswNgXpVlZxIIJnZShFgbZXtA3FVIqG06lU3SE6dKYDji4BjRh0PbbxkaYSorpgP1r&#13;&#10;wD8rdohUFWzowFVpAa8lKH50lZv40/TNzHH8NRTHZ2QIjV69kw8lkbgUPjwLJIGSlGnpwhMd2kCd&#13;&#10;c2gtzraAv669x3jSDXk5q0nwOfc/dwIVZ+abJUV9GYxGcUPSZXTzeUgXvPSsLz12Vy2A+CcBUHfJ&#13;&#10;jPHBnEyNUL3Rbs5jVXIJK6l2zmXA02URmkWk7ZZqPk9htBVOhKVdORmTR1ajSF4PbwJdq6RAEnyE&#13;&#10;03KIyTtBNbERaWG+C6DLpLYzry3ftFFJr+32x5W9vKeo83/U7DcAAAD//wMAUEsDBBQABgAIAAAA&#13;&#10;IQDGnnCu3wAAAA0BAAAPAAAAZHJzL2Rvd25yZXYueG1sTI/NTsNADITvSLzDykjc6CY0qmiaTVWo&#13;&#10;Clcof1c3a5KIrDfKbtrw9rgnuFgejTz+plhPrlNHGkLr2UA6S0ARV962XBt4e93d3IEKEdli55kM&#13;&#10;/FCAdXl5UWBu/Ylf6LiPtZIQDjkaaGLsc61D1ZDDMPM9sXhffnAYRQ61tgOeJNx1+jZJFtphy/Kh&#13;&#10;wZ4eGqq+96MzMFaP9591v3ne7ub8pH26dO8f1pjrq2m7krFZgYo0xb8LOHcQfigF7OBHtkF1opNM&#13;&#10;+KOBLAV19rOFLAfR8yXostD/W5S/AAAA//8DAFBLAQItABQABgAIAAAAIQC2gziS/gAAAOEBAAAT&#13;&#10;AAAAAAAAAAAAAAAAAAAAAABbQ29udGVudF9UeXBlc10ueG1sUEsBAi0AFAAGAAgAAAAhADj9If/W&#13;&#10;AAAAlAEAAAsAAAAAAAAAAAAAAAAALwEAAF9yZWxzLy5yZWxzUEsBAi0AFAAGAAgAAAAhAAMwOYpH&#13;&#10;AgAA6wQAAA4AAAAAAAAAAAAAAAAALgIAAGRycy9lMm9Eb2MueG1sUEsBAi0AFAAGAAgAAAAhAMae&#13;&#10;cK7fAAAADQEAAA8AAAAAAAAAAAAAAAAAoQQAAGRycy9kb3ducmV2LnhtbFBLBQYAAAAABAAEAPMA&#13;&#10;AACtBQAAAAA=&#13;&#10;" fillcolor="white [3201]" strokecolor="#4ea72e [3209]" strokeweight="1pt"/>
-                        </w:pict>
-                      </mc:Fallback>
-                    </mc:AlternateContent>
-                  </w:r>
-                  <w:r>
-                    <w:rPr>
-                      <w:rFonts w:ascii="Arial" w:hAnsi="Arial" w:cs="Arial"/>
-                      <w:b/>
-                      <w:bCs/>
+                    <w:t xml:space="preserve"> </w:t>
+                  </w:r>
+                  <w:r>
+                    <w:rPr>
+                      <w:rFonts w:ascii="Arial" w:hAnsi="Arial" w:cs="Arial"/>
                       <w:sz w:val="18"/>
                       <w:szCs w:val="18"/>
                     </w:rPr>
-                    <w:t xml:space="preserve">Old </w:t>
+                    <w:t xml:space="preserve"> </w:t>
                   </w:r>
                   <w:r>
                     <w:rPr>
@@ -8435,19 +8273,18 @@
                       <w:sz w:val="18"/>
                       <w:szCs w:val="18"/>
                     </w:rPr>
-                    <w:t xml:space="preserve">Units </w:t>
-                  </w:r>
-                </w:p>
-                <w:p>
-                  <w:pPr>
-                    <w:shd w:val="clear" w:color="auto" w:fill="E8E8E8" w:themeFill="background2"/>
-                    <w:ind w:right="126"/>
-                    <w:rPr>
-                      <w:rFonts w:ascii="Arial" w:hAnsi="Arial" w:cs="Arial"/>
+                    <w:t>{{Label</w:t>
+                  </w:r>
+                  <w:r>
+                    <w:rPr>
+                      <w:rFonts w:ascii="Arial" w:hAnsi="Arial" w:cs="Arial"/>
+                      <w:b/>
+                      <w:bCs/>
                       <w:sz w:val="18"/>
                       <w:szCs w:val="18"/>
                     </w:rPr>
-                  </w:pPr>
+                    <w:t>4</w:t>
+                  </w:r>
                   <w:r>
                     <w:rPr>
                       <w:rFonts w:ascii="Arial" w:hAnsi="Arial" w:cs="Arial"/>
@@ -8456,24 +8293,7 @@
                       <w:sz w:val="18"/>
                       <w:szCs w:val="18"/>
                     </w:rPr>
-                    <w:t>Remaining:</w:t>
-                  </w:r>
-                  <w:r>
-                    <w:rPr>
-                      <w:rFonts w:ascii="Arial" w:hAnsi="Arial" w:cs="Arial"/>
-                      <w:noProof/>
-                      <w:sz w:val="18"/>
-                      <w:szCs w:val="18"/>
-                    </w:rPr>
-                    <w:t xml:space="preserve"> </w:t>
-                  </w:r>
-                  <w:r>
-                    <w:rPr>
-                      <w:rFonts w:ascii="Arial" w:hAnsi="Arial" w:cs="Arial"/>
-                      <w:sz w:val="18"/>
-                      <w:szCs w:val="18"/>
-                    </w:rPr>
-                    <w:t xml:space="preserve"> </w:t>
+                    <w:t>.POS}}</w:t>
                   </w:r>
                   <w:r>
                     <w:rPr>
@@ -8809,27 +8629,7 @@
                       <w:sz w:val="16"/>
                       <w:szCs w:val="16"/>
                     </w:rPr>
-                    <w:t>{{Label</w:t>
-                  </w:r>
-                  <w:r>
-                    <w:rPr>
-                      <w:rFonts w:ascii="Arial" w:hAnsi="Arial" w:cs="Arial"/>
-                      <w:b/>
-                      <w:bCs/>
-                      <w:sz w:val="16"/>
-                      <w:szCs w:val="16"/>
-                    </w:rPr>
-                    <w:t>4</w:t>
-                  </w:r>
-                  <w:r>
-                    <w:rPr>
-                      <w:rFonts w:ascii="Arial" w:hAnsi="Arial" w:cs="Arial"/>
-                      <w:b/>
-                      <w:bCs/>
-                      <w:sz w:val="16"/>
-                      <w:szCs w:val="16"/>
-                    </w:rPr>
-                    <w:t>.QuantityReceived}}</w:t>
+                    <w:t>{{Label4.QuantityReceived}}</w:t>
                   </w:r>
                 </w:p>
                 <w:p>

</xml_diff>

<commit_message>
Remove POSaBit integration; trim Data View and app surface
- Drop posabit_menu and related app routes/logic; simplify data_view template
- Adjust run.py, wsgi.py, helpers, requirements; update InventorySlips.docx

Co-authored-by: Cursor <cursoragent@cursor.com>
</commit_message>
<xml_diff>
--- a/templates/documents/InventorySlips.docx
+++ b/templates/documents/InventorySlips.docx
@@ -266,79 +266,109 @@
                       <w:rFonts w:ascii="Arial" w:hAnsi="Arial" w:cs="Arial"/>
                       <w:b/>
                       <w:bCs/>
-                      <w:sz w:val="18"/>
-                      <w:szCs w:val="18"/>
-                    </w:rPr>
-                    <w:t xml:space="preserve">Old </w:t>
-                  </w:r>
-                  <w:r>
-                    <w:rPr>
-                      <w:rFonts w:ascii="Arial" w:hAnsi="Arial" w:cs="Arial"/>
-                      <w:b/>
-                      <w:bCs/>
-                      <w:sz w:val="18"/>
-                      <w:szCs w:val="18"/>
-                    </w:rPr>
-                    <w:t xml:space="preserve">Units </w:t>
-                  </w:r>
-                </w:p>
-                <w:p>
-                  <w:pPr>
-                    <w:shd w:val="clear" w:color="auto" w:fill="E8E8E8" w:themeFill="background2"/>
-                    <w:ind w:right="126"/>
-                    <w:rPr>
-                      <w:rFonts w:ascii="Arial" w:hAnsi="Arial" w:cs="Arial"/>
-                      <w:sz w:val="18"/>
-                      <w:szCs w:val="18"/>
-                    </w:rPr>
-                  </w:pPr>
-                  <w:r>
-                    <w:rPr>
-                      <w:rFonts w:ascii="Arial" w:hAnsi="Arial" w:cs="Arial"/>
-                      <w:b/>
-                      <w:bCs/>
-                      <w:sz w:val="18"/>
-                      <w:szCs w:val="18"/>
-                    </w:rPr>
-                    <w:t>Remaining:</w:t>
-                  </w:r>
-                  <w:proofErr w:type="gramStart"/>
-                  <w:r>
-                    <w:rPr>
-                      <w:rFonts w:ascii="Arial" w:hAnsi="Arial" w:cs="Arial"/>
                       <w:noProof/>
                       <w:sz w:val="18"/>
                       <w:szCs w:val="18"/>
                     </w:rPr>
-                    <w:t xml:space="preserve"> </w:t>
-                  </w:r>
-                  <w:r>
-                    <w:rPr>
-                      <w:rFonts w:ascii="Arial" w:hAnsi="Arial" w:cs="Arial"/>
+                    <mc:AlternateContent>
+                      <mc:Choice Requires="wps">
+                        <w:drawing>
+                          <wp:anchor distT="0" distB="0" distL="114300" distR="114300" simplePos="0" relativeHeight="251686912" behindDoc="0" locked="0" layoutInCell="1" allowOverlap="1" wp14:anchorId="5C5F1AFC" wp14:editId="258E496A">
+                            <wp:simplePos x="0" y="0"/>
+                            <wp:positionH relativeFrom="column">
+                              <wp:posOffset>665723</wp:posOffset>
+                            </wp:positionH>
+                            <wp:positionV relativeFrom="paragraph">
+                              <wp:posOffset>26279</wp:posOffset>
+                            </wp:positionV>
+                            <wp:extent cx="262011" cy="252486"/>
+                            <wp:effectExtent l="0" t="0" r="17780" b="14605"/>
+                            <wp:wrapNone/>
+                            <wp:docPr id="1200732041" name="Rectangle 1"/>
+                            <wp:cNvGraphicFramePr/>
+                            <a:graphic xmlns:a="http://schemas.openxmlformats.org/drawingml/2006/main">
+                              <a:graphicData uri="http://schemas.microsoft.com/office/word/2010/wordprocessingShape">
+                                <wps:wsp>
+                                  <wps:cNvSpPr/>
+                                  <wps:spPr>
+                                    <a:xfrm>
+                                      <a:off x="0" y="0"/>
+                                      <a:ext cx="262011" cy="252486"/>
+                                    </a:xfrm>
+                                    <a:prstGeom prst="rect">
+                                      <a:avLst/>
+                                    </a:prstGeom>
+                                  </wps:spPr>
+                                  <wps:style>
+                                    <a:lnRef idx="2">
+                                      <a:schemeClr val="accent6"/>
+                                    </a:lnRef>
+                                    <a:fillRef idx="1">
+                                      <a:schemeClr val="lt1"/>
+                                    </a:fillRef>
+                                    <a:effectRef idx="0">
+                                      <a:schemeClr val="accent6"/>
+                                    </a:effectRef>
+                                    <a:fontRef idx="minor">
+                                      <a:schemeClr val="dk1"/>
+                                    </a:fontRef>
+                                  </wps:style>
+                                  <wps:bodyPr rot="0" spcFirstLastPara="0" vertOverflow="overflow" horzOverflow="overflow" vert="horz" wrap="square" lIns="91440" tIns="45720" rIns="91440" bIns="45720" numCol="1" spcCol="0" rtlCol="0" fromWordArt="0" anchor="ctr" anchorCtr="0" forceAA="0" compatLnSpc="1">
+                                    <a:prstTxWarp prst="textNoShape">
+                                      <a:avLst/>
+                                    </a:prstTxWarp>
+                                    <a:noAutofit/>
+                                  </wps:bodyPr>
+                                </wps:wsp>
+                              </a:graphicData>
+                            </a:graphic>
+                            <wp14:sizeRelH relativeFrom="margin">
+                              <wp14:pctWidth>0</wp14:pctWidth>
+                            </wp14:sizeRelH>
+                            <wp14:sizeRelV relativeFrom="margin">
+                              <wp14:pctHeight>0</wp14:pctHeight>
+                            </wp14:sizeRelV>
+                          </wp:anchor>
+                        </w:drawing>
+                      </mc:Choice>
+                      <mc:Fallback>
+                        <w:pict>
+                          <v:rect w14:anchorId="4928B800" id="Rectangle 1" o:spid="_x0000_s1026" style="position:absolute;margin-left:52.4pt;margin-top:2.05pt;width:20.65pt;height:19.9pt;z-index:251686912;visibility:visible;mso-wrap-style:square;mso-width-percent:0;mso-height-percent:0;mso-wrap-distance-left:9pt;mso-wrap-distance-top:0;mso-wrap-distance-right:9pt;mso-wrap-distance-bottom:0;mso-position-horizontal:absolute;mso-position-horizontal-relative:text;mso-position-vertical:absolute;mso-position-vertical-relative:text;mso-width-percent:0;mso-height-percent:0;mso-width-relative:margin;mso-height-relative:margin;v-text-anchor:middle" o:gfxdata="UEsDBBQABgAIAAAAIQC2gziS/gAAAOEBAAATAAAAW0NvbnRlbnRfVHlwZXNdLnhtbJSRQU7DMBBF&#13;&#10;90jcwfIWJU67QAgl6YK0S0CoHGBkTxKLZGx5TGhvj5O2G0SRWNoz/78nu9wcxkFMGNg6quQqL6RA&#13;&#10;0s5Y6ir5vt9lD1JwBDIwOMJKHpHlpr69KfdHjyxSmriSfYz+USnWPY7AufNIadK6MEJMx9ApD/oD&#13;&#10;OlTrorhX2lFEilmcO2RdNtjC5xDF9pCuTyYBB5bi6bQ4syoJ3g9WQ0ymaiLzg5KdCXlKLjvcW893&#13;&#10;SUOqXwnz5DrgnHtJTxOsQfEKIT7DmDSUCaxw7Rqn8787ZsmRM9e2VmPeBN4uqYvTtW7jvijg9N/y&#13;&#10;JsXecLq0q+WD6m8AAAD//wMAUEsDBBQABgAIAAAAIQA4/SH/1gAAAJQBAAALAAAAX3JlbHMvLnJl&#13;&#10;bHOkkMFqwzAMhu+DvYPRfXGawxijTi+j0GvpHsDYimMaW0Yy2fr2M4PBMnrbUb/Q94l/f/hMi1qR&#13;&#10;JVI2sOt6UJgd+ZiDgffL8ekFlFSbvV0oo4EbChzGx4f9GRdb25HMsYhqlCwG5lrLq9biZkxWOiqY&#13;&#10;22YiTra2kYMu1l1tQD30/bPm3wwYN0x18gb45AdQl1tp5j/sFB2T0FQ7R0nTNEV3j6o9feQzro1i&#13;&#10;OWA14Fm+Q8a1a8+Bvu/d/dMb2JY5uiPbhG/ktn4cqGU/er3pcvwCAAD//wMAUEsDBBQABgAIAAAA&#13;&#10;IQADMDmKRwIAAOsEAAAOAAAAZHJzL2Uyb0RvYy54bWysVE1vGjEQvVfqf7B8LwuI0BSxRIgoVSWU&#13;&#10;RCFVzsZrw6pejzs2LPTXd+xdFppyqnoxY8+8+Xj7hundoTJsr9CXYHM+6PU5U1ZCUdpNzr+/Pny6&#13;&#10;5cwHYQthwKqcH5Xnd7OPH6a1m6ghbMEUChklsX5Su5xvQ3CTLPNyqyrhe+CUJacGrESgK26yAkVN&#13;&#10;2SuTDfv9cVYDFg5BKu/p9b5x8lnKr7WS4UlrrwIzOafeQjoxnet4ZrOpmGxQuG0p2zbEP3RRidJS&#13;&#10;0S7VvQiC7bD8K1VVSgQPOvQkVBloXUqVZqBpBv1306y2wqk0C5HjXUeT/39p5eN+5Z6RaKidn3gy&#13;&#10;4xQHjVX8pf7YIZF17MhSh8AkPQ7H1PGAM0mu4c1wdDuOZGZnsEMfviqoWDRyjvQtEkViv/ShCT2F&#13;&#10;EO5cPlnhaFTswNgXpVlZxIIJnZShFgbZXtA3FVIqG06lU3SE6dKYDji4BjRh0PbbxkaYSorpgP1r&#13;&#10;wD8rdohUFWzowFVpAa8lKH50lZv40/TNzHH8NRTHZ2QIjV69kw8lkbgUPjwLJIGSlGnpwhMd2kCd&#13;&#10;c2gtzraAv669x3jSDXk5q0nwOfc/dwIVZ+abJUV9GYxGcUPSZXTzeUgXvPSsLz12Vy2A+CcBUHfJ&#13;&#10;jPHBnEyNUL3Rbs5jVXIJK6l2zmXA02URmkWk7ZZqPk9htBVOhKVdORmTR1ajSF4PbwJdq6RAEnyE&#13;&#10;03KIyTtBNbERaWG+C6DLpLYzry3ftFFJr+32x5W9vKeo83/U7DcAAAD//wMAUEsDBBQABgAIAAAA&#13;&#10;IQDGnnCu3wAAAA0BAAAPAAAAZHJzL2Rvd25yZXYueG1sTI/NTsNADITvSLzDykjc6CY0qmiaTVWo&#13;&#10;Clcof1c3a5KIrDfKbtrw9rgnuFgejTz+plhPrlNHGkLr2UA6S0ARV962XBt4e93d3IEKEdli55kM&#13;&#10;/FCAdXl5UWBu/Ylf6LiPtZIQDjkaaGLsc61D1ZDDMPM9sXhffnAYRQ61tgOeJNx1+jZJFtphy/Kh&#13;&#10;wZ4eGqq+96MzMFaP9591v3ne7ub8pH26dO8f1pjrq2m7krFZgYo0xb8LOHcQfigF7OBHtkF1opNM&#13;&#10;+KOBLAV19rOFLAfR8yXostD/W5S/AAAA//8DAFBLAQItABQABgAIAAAAIQC2gziS/gAAAOEBAAAT&#13;&#10;AAAAAAAAAAAAAAAAAAAAAABbQ29udGVudF9UeXBlc10ueG1sUEsBAi0AFAAGAAgAAAAhADj9If/W&#13;&#10;AAAAlAEAAAsAAAAAAAAAAAAAAAAALwEAAF9yZWxzLy5yZWxzUEsBAi0AFAAGAAgAAAAhAAMwOYpH&#13;&#10;AgAA6wQAAA4AAAAAAAAAAAAAAAAALgIAAGRycy9lMm9Eb2MueG1sUEsBAi0AFAAGAAgAAAAhAMae&#13;&#10;cK7fAAAADQEAAA8AAAAAAAAAAAAAAAAAoQQAAGRycy9kb3ducmV2LnhtbFBLBQYAAAAABAAEAPMA&#13;&#10;AACtBQAAAAA=&#13;&#10;" fillcolor="white [3201]" strokecolor="#4ea72e [3209]" strokeweight="1pt"/>
+                        </w:pict>
+                      </mc:Fallback>
+                    </mc:AlternateContent>
+                  </w:r>
+                  <w:r>
+                    <w:rPr>
+                      <w:rFonts w:ascii="Arial" w:hAnsi="Arial" w:cs="Arial"/>
+                      <w:b/>
+                      <w:bCs/>
                       <w:sz w:val="18"/>
                       <w:szCs w:val="18"/>
                     </w:rPr>
-                    <w:t xml:space="preserve"> </w:t>
-                  </w:r>
-                  <w:r>
-                    <w:rPr>
-                      <w:rFonts w:ascii="Arial" w:hAnsi="Arial" w:cs="Arial"/>
+                    <w:t xml:space="preserve">Old </w:t>
+                  </w:r>
+                  <w:r>
+                    <w:rPr>
+                      <w:rFonts w:ascii="Arial" w:hAnsi="Arial" w:cs="Arial"/>
+                      <w:b/>
+                      <w:bCs/>
                       <w:sz w:val="18"/>
                       <w:szCs w:val="18"/>
                     </w:rPr>
-                    <w:t xml:space="preserve"> </w:t>
-                  </w:r>
-                  <w:r>
-                    <w:rPr>
-                      <w:rFonts w:ascii="Arial" w:hAnsi="Arial" w:cs="Arial"/>
-                      <w:b/>
-                      <w:bCs/>
+                    <w:t xml:space="preserve">Units </w:t>
+                  </w:r>
+                </w:p>
+                <w:p>
+                  <w:pPr>
+                    <w:shd w:val="clear" w:color="auto" w:fill="E8E8E8" w:themeFill="background2"/>
+                    <w:ind w:right="126"/>
+                    <w:rPr>
+                      <w:rFonts w:ascii="Arial" w:hAnsi="Arial" w:cs="Arial"/>
                       <w:sz w:val="18"/>
                       <w:szCs w:val="18"/>
                     </w:rPr>
-                    <w:t>{</w:t>
-                  </w:r>
-                  <w:proofErr w:type="gramEnd"/>
+                  </w:pPr>
                   <w:r>
                     <w:rPr>
                       <w:rFonts w:ascii="Arial" w:hAnsi="Arial" w:cs="Arial"/>
@@ -347,27 +377,24 @@
                       <w:sz w:val="18"/>
                       <w:szCs w:val="18"/>
                     </w:rPr>
-                    <w:t>{Label1.</w:t>
-                  </w:r>
-                  <w:r>
-                    <w:rPr>
-                      <w:rFonts w:ascii="Arial" w:hAnsi="Arial" w:cs="Arial"/>
-                      <w:b/>
-                      <w:bCs/>
+                    <w:t>Remaining:</w:t>
+                  </w:r>
+                  <w:r>
+                    <w:rPr>
+                      <w:rFonts w:ascii="Arial" w:hAnsi="Arial" w:cs="Arial"/>
+                      <w:noProof/>
                       <w:sz w:val="18"/>
                       <w:szCs w:val="18"/>
                     </w:rPr>
-                    <w:t>POS</w:t>
-                  </w:r>
-                  <w:r>
-                    <w:rPr>
-                      <w:rFonts w:ascii="Arial" w:hAnsi="Arial" w:cs="Arial"/>
-                      <w:b/>
-                      <w:bCs/>
+                    <w:t xml:space="preserve"> </w:t>
+                  </w:r>
+                  <w:r>
+                    <w:rPr>
+                      <w:rFonts w:ascii="Arial" w:hAnsi="Arial" w:cs="Arial"/>
                       <w:sz w:val="18"/>
                       <w:szCs w:val="18"/>
                     </w:rPr>
-                    <w:t>}}</w:t>
+                    <w:t xml:space="preserve"> </w:t>
                   </w:r>
                   <w:r>
                     <w:rPr>
@@ -375,6 +402,14 @@
                       <w:sz w:val="18"/>
                       <w:szCs w:val="18"/>
                     </w:rPr>
+                    <w:t xml:space="preserve"> </w:t>
+                  </w:r>
+                  <w:r>
+                    <w:rPr>
+                      <w:rFonts w:ascii="Arial" w:hAnsi="Arial" w:cs="Arial"/>
+                      <w:sz w:val="18"/>
+                      <w:szCs w:val="18"/>
+                    </w:rPr>
                     <w:br/>
                   </w:r>
                   <w:r>
@@ -395,7 +430,17 @@
                       <w:sz w:val="10"/>
                       <w:szCs w:val="10"/>
                     </w:rPr>
-                    <w:t xml:space="preserve">(All employees must check </w:t>
+                    <w:t>(</w:t>
+                  </w:r>
+                  <w:r>
+                    <w:rPr>
+                      <w:rFonts w:ascii="Arial" w:hAnsi="Arial" w:cs="Arial"/>
+                      <w:i/>
+                      <w:iCs/>
+                      <w:sz w:val="10"/>
+                      <w:szCs w:val="10"/>
+                    </w:rPr>
+                    <w:t xml:space="preserve">All employees must check </w:t>
                   </w:r>
                   <w:r>
                     <w:rPr>
@@ -2906,79 +2951,109 @@
                       <w:rFonts w:ascii="Arial" w:hAnsi="Arial" w:cs="Arial"/>
                       <w:b/>
                       <w:bCs/>
-                      <w:sz w:val="18"/>
-                      <w:szCs w:val="18"/>
-                    </w:rPr>
-                    <w:t xml:space="preserve">Old </w:t>
-                  </w:r>
-                  <w:r>
-                    <w:rPr>
-                      <w:rFonts w:ascii="Arial" w:hAnsi="Arial" w:cs="Arial"/>
-                      <w:b/>
-                      <w:bCs/>
-                      <w:sz w:val="18"/>
-                      <w:szCs w:val="18"/>
-                    </w:rPr>
-                    <w:t xml:space="preserve">Units </w:t>
-                  </w:r>
-                </w:p>
-                <w:p>
-                  <w:pPr>
-                    <w:shd w:val="clear" w:color="auto" w:fill="E8E8E8" w:themeFill="background2"/>
-                    <w:ind w:right="126"/>
-                    <w:rPr>
-                      <w:rFonts w:ascii="Arial" w:hAnsi="Arial" w:cs="Arial"/>
-                      <w:sz w:val="18"/>
-                      <w:szCs w:val="18"/>
-                    </w:rPr>
-                  </w:pPr>
-                  <w:r>
-                    <w:rPr>
-                      <w:rFonts w:ascii="Arial" w:hAnsi="Arial" w:cs="Arial"/>
-                      <w:b/>
-                      <w:bCs/>
-                      <w:sz w:val="18"/>
-                      <w:szCs w:val="18"/>
-                    </w:rPr>
-                    <w:t>Remaining:</w:t>
-                  </w:r>
-                  <w:proofErr w:type="gramStart"/>
-                  <w:r>
-                    <w:rPr>
-                      <w:rFonts w:ascii="Arial" w:hAnsi="Arial" w:cs="Arial"/>
                       <w:noProof/>
                       <w:sz w:val="18"/>
                       <w:szCs w:val="18"/>
                     </w:rPr>
-                    <w:t xml:space="preserve"> </w:t>
-                  </w:r>
-                  <w:r>
-                    <w:rPr>
-                      <w:rFonts w:ascii="Arial" w:hAnsi="Arial" w:cs="Arial"/>
+                    <mc:AlternateContent>
+                      <mc:Choice Requires="wps">
+                        <w:drawing>
+                          <wp:anchor distT="0" distB="0" distL="114300" distR="114300" simplePos="0" relativeHeight="251708416" behindDoc="0" locked="0" layoutInCell="1" allowOverlap="1" wp14:anchorId="1B3F6B31" wp14:editId="6B000267">
+                            <wp:simplePos x="0" y="0"/>
+                            <wp:positionH relativeFrom="column">
+                              <wp:posOffset>665723</wp:posOffset>
+                            </wp:positionH>
+                            <wp:positionV relativeFrom="paragraph">
+                              <wp:posOffset>26279</wp:posOffset>
+                            </wp:positionV>
+                            <wp:extent cx="262011" cy="252486"/>
+                            <wp:effectExtent l="0" t="0" r="17780" b="14605"/>
+                            <wp:wrapNone/>
+                            <wp:docPr id="1477200954" name="Rectangle 1"/>
+                            <wp:cNvGraphicFramePr/>
+                            <a:graphic xmlns:a="http://schemas.openxmlformats.org/drawingml/2006/main">
+                              <a:graphicData uri="http://schemas.microsoft.com/office/word/2010/wordprocessingShape">
+                                <wps:wsp>
+                                  <wps:cNvSpPr/>
+                                  <wps:spPr>
+                                    <a:xfrm>
+                                      <a:off x="0" y="0"/>
+                                      <a:ext cx="262011" cy="252486"/>
+                                    </a:xfrm>
+                                    <a:prstGeom prst="rect">
+                                      <a:avLst/>
+                                    </a:prstGeom>
+                                  </wps:spPr>
+                                  <wps:style>
+                                    <a:lnRef idx="2">
+                                      <a:schemeClr val="accent6"/>
+                                    </a:lnRef>
+                                    <a:fillRef idx="1">
+                                      <a:schemeClr val="lt1"/>
+                                    </a:fillRef>
+                                    <a:effectRef idx="0">
+                                      <a:schemeClr val="accent6"/>
+                                    </a:effectRef>
+                                    <a:fontRef idx="minor">
+                                      <a:schemeClr val="dk1"/>
+                                    </a:fontRef>
+                                  </wps:style>
+                                  <wps:bodyPr rot="0" spcFirstLastPara="0" vertOverflow="overflow" horzOverflow="overflow" vert="horz" wrap="square" lIns="91440" tIns="45720" rIns="91440" bIns="45720" numCol="1" spcCol="0" rtlCol="0" fromWordArt="0" anchor="ctr" anchorCtr="0" forceAA="0" compatLnSpc="1">
+                                    <a:prstTxWarp prst="textNoShape">
+                                      <a:avLst/>
+                                    </a:prstTxWarp>
+                                    <a:noAutofit/>
+                                  </wps:bodyPr>
+                                </wps:wsp>
+                              </a:graphicData>
+                            </a:graphic>
+                            <wp14:sizeRelH relativeFrom="margin">
+                              <wp14:pctWidth>0</wp14:pctWidth>
+                            </wp14:sizeRelH>
+                            <wp14:sizeRelV relativeFrom="margin">
+                              <wp14:pctHeight>0</wp14:pctHeight>
+                            </wp14:sizeRelV>
+                          </wp:anchor>
+                        </w:drawing>
+                      </mc:Choice>
+                      <mc:Fallback>
+                        <w:pict>
+                          <v:rect w14:anchorId="0F9D7D4F" id="Rectangle 1" o:spid="_x0000_s1026" style="position:absolute;margin-left:52.4pt;margin-top:2.05pt;width:20.65pt;height:19.9pt;z-index:251708416;visibility:visible;mso-wrap-style:square;mso-width-percent:0;mso-height-percent:0;mso-wrap-distance-left:9pt;mso-wrap-distance-top:0;mso-wrap-distance-right:9pt;mso-wrap-distance-bottom:0;mso-position-horizontal:absolute;mso-position-horizontal-relative:text;mso-position-vertical:absolute;mso-position-vertical-relative:text;mso-width-percent:0;mso-height-percent:0;mso-width-relative:margin;mso-height-relative:margin;v-text-anchor:middle" o:gfxdata="UEsDBBQABgAIAAAAIQC2gziS/gAAAOEBAAATAAAAW0NvbnRlbnRfVHlwZXNdLnhtbJSRQU7DMBBF&#13;&#10;90jcwfIWJU67QAgl6YK0S0CoHGBkTxKLZGx5TGhvj5O2G0SRWNoz/78nu9wcxkFMGNg6quQqL6RA&#13;&#10;0s5Y6ir5vt9lD1JwBDIwOMJKHpHlpr69KfdHjyxSmriSfYz+USnWPY7AufNIadK6MEJMx9ApD/oD&#13;&#10;OlTrorhX2lFEilmcO2RdNtjC5xDF9pCuTyYBB5bi6bQ4syoJ3g9WQ0ymaiLzg5KdCXlKLjvcW893&#13;&#10;SUOqXwnz5DrgnHtJTxOsQfEKIT7DmDSUCaxw7Rqn8787ZsmRM9e2VmPeBN4uqYvTtW7jvijg9N/y&#13;&#10;JsXecLq0q+WD6m8AAAD//wMAUEsDBBQABgAIAAAAIQA4/SH/1gAAAJQBAAALAAAAX3JlbHMvLnJl&#13;&#10;bHOkkMFqwzAMhu+DvYPRfXGawxijTi+j0GvpHsDYimMaW0Yy2fr2M4PBMnrbUb/Q94l/f/hMi1qR&#13;&#10;JVI2sOt6UJgd+ZiDgffL8ekFlFSbvV0oo4EbChzGx4f9GRdb25HMsYhqlCwG5lrLq9biZkxWOiqY&#13;&#10;22YiTra2kYMu1l1tQD30/bPm3wwYN0x18gb45AdQl1tp5j/sFB2T0FQ7R0nTNEV3j6o9feQzro1i&#13;&#10;OWA14Fm+Q8a1a8+Bvu/d/dMb2JY5uiPbhG/ktn4cqGU/er3pcvwCAAD//wMAUEsDBBQABgAIAAAA&#13;&#10;IQADMDmKRwIAAOsEAAAOAAAAZHJzL2Uyb0RvYy54bWysVE1vGjEQvVfqf7B8LwuI0BSxRIgoVSWU&#13;&#10;RCFVzsZrw6pejzs2LPTXd+xdFppyqnoxY8+8+Xj7hundoTJsr9CXYHM+6PU5U1ZCUdpNzr+/Pny6&#13;&#10;5cwHYQthwKqcH5Xnd7OPH6a1m6ghbMEUChklsX5Su5xvQ3CTLPNyqyrhe+CUJacGrESgK26yAkVN&#13;&#10;2SuTDfv9cVYDFg5BKu/p9b5x8lnKr7WS4UlrrwIzOafeQjoxnet4ZrOpmGxQuG0p2zbEP3RRidJS&#13;&#10;0S7VvQiC7bD8K1VVSgQPOvQkVBloXUqVZqBpBv1306y2wqk0C5HjXUeT/39p5eN+5Z6RaKidn3gy&#13;&#10;4xQHjVX8pf7YIZF17MhSh8AkPQ7H1PGAM0mu4c1wdDuOZGZnsEMfviqoWDRyjvQtEkViv/ShCT2F&#13;&#10;EO5cPlnhaFTswNgXpVlZxIIJnZShFgbZXtA3FVIqG06lU3SE6dKYDji4BjRh0PbbxkaYSorpgP1r&#13;&#10;wD8rdohUFWzowFVpAa8lKH50lZv40/TNzHH8NRTHZ2QIjV69kw8lkbgUPjwLJIGSlGnpwhMd2kCd&#13;&#10;c2gtzraAv669x3jSDXk5q0nwOfc/dwIVZ+abJUV9GYxGcUPSZXTzeUgXvPSsLz12Vy2A+CcBUHfJ&#13;&#10;jPHBnEyNUL3Rbs5jVXIJK6l2zmXA02URmkWk7ZZqPk9htBVOhKVdORmTR1ajSF4PbwJdq6RAEnyE&#13;&#10;03KIyTtBNbERaWG+C6DLpLYzry3ftFFJr+32x5W9vKeo83/U7DcAAAD//wMAUEsDBBQABgAIAAAA&#13;&#10;IQDGnnCu3wAAAA0BAAAPAAAAZHJzL2Rvd25yZXYueG1sTI/NTsNADITvSLzDykjc6CY0qmiaTVWo&#13;&#10;Clcof1c3a5KIrDfKbtrw9rgnuFgejTz+plhPrlNHGkLr2UA6S0ARV962XBt4e93d3IEKEdli55kM&#13;&#10;/FCAdXl5UWBu/Ylf6LiPtZIQDjkaaGLsc61D1ZDDMPM9sXhffnAYRQ61tgOeJNx1+jZJFtphy/Kh&#13;&#10;wZ4eGqq+96MzMFaP9591v3ne7ub8pH26dO8f1pjrq2m7krFZgYo0xb8LOHcQfigF7OBHtkF1opNM&#13;&#10;+KOBLAV19rOFLAfR8yXostD/W5S/AAAA//8DAFBLAQItABQABgAIAAAAIQC2gziS/gAAAOEBAAAT&#13;&#10;AAAAAAAAAAAAAAAAAAAAAABbQ29udGVudF9UeXBlc10ueG1sUEsBAi0AFAAGAAgAAAAhADj9If/W&#13;&#10;AAAAlAEAAAsAAAAAAAAAAAAAAAAALwEAAF9yZWxzLy5yZWxzUEsBAi0AFAAGAAgAAAAhAAMwOYpH&#13;&#10;AgAA6wQAAA4AAAAAAAAAAAAAAAAALgIAAGRycy9lMm9Eb2MueG1sUEsBAi0AFAAGAAgAAAAhAMae&#13;&#10;cK7fAAAADQEAAA8AAAAAAAAAAAAAAAAAoQQAAGRycy9kb3ducmV2LnhtbFBLBQYAAAAABAAEAPMA&#13;&#10;AACtBQAAAAA=&#13;&#10;" fillcolor="white [3201]" strokecolor="#4ea72e [3209]" strokeweight="1pt"/>
+                        </w:pict>
+                      </mc:Fallback>
+                    </mc:AlternateContent>
+                  </w:r>
+                  <w:r>
+                    <w:rPr>
+                      <w:rFonts w:ascii="Arial" w:hAnsi="Arial" w:cs="Arial"/>
+                      <w:b/>
+                      <w:bCs/>
                       <w:sz w:val="18"/>
                       <w:szCs w:val="18"/>
                     </w:rPr>
-                    <w:t xml:space="preserve"> </w:t>
-                  </w:r>
-                  <w:r>
-                    <w:rPr>
-                      <w:rFonts w:ascii="Arial" w:hAnsi="Arial" w:cs="Arial"/>
+                    <w:t xml:space="preserve">Old </w:t>
+                  </w:r>
+                  <w:r>
+                    <w:rPr>
+                      <w:rFonts w:ascii="Arial" w:hAnsi="Arial" w:cs="Arial"/>
+                      <w:b/>
+                      <w:bCs/>
                       <w:sz w:val="18"/>
                       <w:szCs w:val="18"/>
                     </w:rPr>
-                    <w:t xml:space="preserve"> </w:t>
-                  </w:r>
-                  <w:r>
-                    <w:rPr>
-                      <w:rFonts w:ascii="Arial" w:hAnsi="Arial" w:cs="Arial"/>
-                      <w:b/>
-                      <w:bCs/>
+                    <w:t xml:space="preserve">Units </w:t>
+                  </w:r>
+                </w:p>
+                <w:p>
+                  <w:pPr>
+                    <w:shd w:val="clear" w:color="auto" w:fill="E8E8E8" w:themeFill="background2"/>
+                    <w:ind w:right="126"/>
+                    <w:rPr>
+                      <w:rFonts w:ascii="Arial" w:hAnsi="Arial" w:cs="Arial"/>
                       <w:sz w:val="18"/>
                       <w:szCs w:val="18"/>
                     </w:rPr>
-                    <w:t>{</w:t>
-                  </w:r>
-                  <w:proofErr w:type="gramEnd"/>
+                  </w:pPr>
                   <w:r>
                     <w:rPr>
                       <w:rFonts w:ascii="Arial" w:hAnsi="Arial" w:cs="Arial"/>
@@ -2987,27 +3062,32 @@
                       <w:sz w:val="18"/>
                       <w:szCs w:val="18"/>
                     </w:rPr>
-                    <w:t>{Label</w:t>
-                  </w:r>
-                  <w:r>
-                    <w:rPr>
-                      <w:rFonts w:ascii="Arial" w:hAnsi="Arial" w:cs="Arial"/>
-                      <w:b/>
-                      <w:bCs/>
+                    <w:t>Remaining:</w:t>
+                  </w:r>
+                  <w:r>
+                    <w:rPr>
+                      <w:rFonts w:ascii="Arial" w:hAnsi="Arial" w:cs="Arial"/>
+                      <w:noProof/>
                       <w:sz w:val="18"/>
                       <w:szCs w:val="18"/>
                     </w:rPr>
-                    <w:t>2</w:t>
-                  </w:r>
-                  <w:r>
-                    <w:rPr>
-                      <w:rFonts w:ascii="Arial" w:hAnsi="Arial" w:cs="Arial"/>
-                      <w:b/>
-                      <w:bCs/>
+                    <w:t xml:space="preserve"> </w:t>
+                  </w:r>
+                  <w:r>
+                    <w:rPr>
+                      <w:rFonts w:ascii="Arial" w:hAnsi="Arial" w:cs="Arial"/>
                       <w:sz w:val="18"/>
                       <w:szCs w:val="18"/>
                     </w:rPr>
-                    <w:t>.POS}}</w:t>
+                    <w:t xml:space="preserve"> </w:t>
+                  </w:r>
+                  <w:r>
+                    <w:rPr>
+                      <w:rFonts w:ascii="Arial" w:hAnsi="Arial" w:cs="Arial"/>
+                      <w:sz w:val="18"/>
+                      <w:szCs w:val="18"/>
+                    </w:rPr>
+                    <w:t xml:space="preserve"> </w:t>
                   </w:r>
                   <w:r>
                     <w:rPr>
@@ -3335,7 +3415,27 @@
                       <w:sz w:val="16"/>
                       <w:szCs w:val="16"/>
                     </w:rPr>
-                    <w:t>{{Label2.QuantityReceived}}</w:t>
+                    <w:t>{{Label</w:t>
+                  </w:r>
+                  <w:r>
+                    <w:rPr>
+                      <w:rFonts w:ascii="Arial" w:hAnsi="Arial" w:cs="Arial"/>
+                      <w:b/>
+                      <w:bCs/>
+                      <w:sz w:val="16"/>
+                      <w:szCs w:val="16"/>
+                    </w:rPr>
+                    <w:t>2</w:t>
+                  </w:r>
+                  <w:r>
+                    <w:rPr>
+                      <w:rFonts w:ascii="Arial" w:hAnsi="Arial" w:cs="Arial"/>
+                      <w:b/>
+                      <w:bCs/>
+                      <w:sz w:val="16"/>
+                      <w:szCs w:val="16"/>
+                    </w:rPr>
+                    <w:t>.QuantityReceived}}</w:t>
                   </w:r>
                 </w:p>
                 <w:p>
@@ -5548,10 +5648,77 @@
                       <w:rFonts w:ascii="Arial" w:hAnsi="Arial" w:cs="Arial"/>
                       <w:b/>
                       <w:bCs/>
+                      <w:noProof/>
                       <w:sz w:val="18"/>
                       <w:szCs w:val="18"/>
                     </w:rPr>
-                    <w:t xml:space="preserve">Old </w:t>
+                    <mc:AlternateContent>
+                      <mc:Choice Requires="wps">
+                        <w:drawing>
+                          <wp:anchor distT="0" distB="0" distL="114300" distR="114300" simplePos="0" relativeHeight="251711488" behindDoc="0" locked="0" layoutInCell="1" allowOverlap="1" wp14:anchorId="0AD2461A" wp14:editId="3FD818D4">
+                            <wp:simplePos x="0" y="0"/>
+                            <wp:positionH relativeFrom="column">
+                              <wp:posOffset>665723</wp:posOffset>
+                            </wp:positionH>
+                            <wp:positionV relativeFrom="paragraph">
+                              <wp:posOffset>26279</wp:posOffset>
+                            </wp:positionV>
+                            <wp:extent cx="262011" cy="252486"/>
+                            <wp:effectExtent l="0" t="0" r="17780" b="14605"/>
+                            <wp:wrapNone/>
+                            <wp:docPr id="2000579283" name="Rectangle 1"/>
+                            <wp:cNvGraphicFramePr/>
+                            <a:graphic xmlns:a="http://schemas.openxmlformats.org/drawingml/2006/main">
+                              <a:graphicData uri="http://schemas.microsoft.com/office/word/2010/wordprocessingShape">
+                                <wps:wsp>
+                                  <wps:cNvSpPr/>
+                                  <wps:spPr>
+                                    <a:xfrm>
+                                      <a:off x="0" y="0"/>
+                                      <a:ext cx="262011" cy="252486"/>
+                                    </a:xfrm>
+                                    <a:prstGeom prst="rect">
+                                      <a:avLst/>
+                                    </a:prstGeom>
+                                  </wps:spPr>
+                                  <wps:style>
+                                    <a:lnRef idx="2">
+                                      <a:schemeClr val="accent6"/>
+                                    </a:lnRef>
+                                    <a:fillRef idx="1">
+                                      <a:schemeClr val="lt1"/>
+                                    </a:fillRef>
+                                    <a:effectRef idx="0">
+                                      <a:schemeClr val="accent6"/>
+                                    </a:effectRef>
+                                    <a:fontRef idx="minor">
+                                      <a:schemeClr val="dk1"/>
+                                    </a:fontRef>
+                                  </wps:style>
+                                  <wps:bodyPr rot="0" spcFirstLastPara="0" vertOverflow="overflow" horzOverflow="overflow" vert="horz" wrap="square" lIns="91440" tIns="45720" rIns="91440" bIns="45720" numCol="1" spcCol="0" rtlCol="0" fromWordArt="0" anchor="ctr" anchorCtr="0" forceAA="0" compatLnSpc="1">
+                                    <a:prstTxWarp prst="textNoShape">
+                                      <a:avLst/>
+                                    </a:prstTxWarp>
+                                    <a:noAutofit/>
+                                  </wps:bodyPr>
+                                </wps:wsp>
+                              </a:graphicData>
+                            </a:graphic>
+                            <wp14:sizeRelH relativeFrom="margin">
+                              <wp14:pctWidth>0</wp14:pctWidth>
+                            </wp14:sizeRelH>
+                            <wp14:sizeRelV relativeFrom="margin">
+                              <wp14:pctHeight>0</wp14:pctHeight>
+                            </wp14:sizeRelV>
+                          </wp:anchor>
+                        </w:drawing>
+                      </mc:Choice>
+                      <mc:Fallback>
+                        <w:pict>
+                          <v:rect w14:anchorId="4E37516F" id="Rectangle 1" o:spid="_x0000_s1026" style="position:absolute;margin-left:52.4pt;margin-top:2.05pt;width:20.65pt;height:19.9pt;z-index:251711488;visibility:visible;mso-wrap-style:square;mso-width-percent:0;mso-height-percent:0;mso-wrap-distance-left:9pt;mso-wrap-distance-top:0;mso-wrap-distance-right:9pt;mso-wrap-distance-bottom:0;mso-position-horizontal:absolute;mso-position-horizontal-relative:text;mso-position-vertical:absolute;mso-position-vertical-relative:text;mso-width-percent:0;mso-height-percent:0;mso-width-relative:margin;mso-height-relative:margin;v-text-anchor:middle" o:gfxdata="UEsDBBQABgAIAAAAIQC2gziS/gAAAOEBAAATAAAAW0NvbnRlbnRfVHlwZXNdLnhtbJSRQU7DMBBF&#13;&#10;90jcwfIWJU67QAgl6YK0S0CoHGBkTxKLZGx5TGhvj5O2G0SRWNoz/78nu9wcxkFMGNg6quQqL6RA&#13;&#10;0s5Y6ir5vt9lD1JwBDIwOMJKHpHlpr69KfdHjyxSmriSfYz+USnWPY7AufNIadK6MEJMx9ApD/oD&#13;&#10;OlTrorhX2lFEilmcO2RdNtjC5xDF9pCuTyYBB5bi6bQ4syoJ3g9WQ0ymaiLzg5KdCXlKLjvcW893&#13;&#10;SUOqXwnz5DrgnHtJTxOsQfEKIT7DmDSUCaxw7Rqn8787ZsmRM9e2VmPeBN4uqYvTtW7jvijg9N/y&#13;&#10;JsXecLq0q+WD6m8AAAD//wMAUEsDBBQABgAIAAAAIQA4/SH/1gAAAJQBAAALAAAAX3JlbHMvLnJl&#13;&#10;bHOkkMFqwzAMhu+DvYPRfXGawxijTi+j0GvpHsDYimMaW0Yy2fr2M4PBMnrbUb/Q94l/f/hMi1qR&#13;&#10;JVI2sOt6UJgd+ZiDgffL8ekFlFSbvV0oo4EbChzGx4f9GRdb25HMsYhqlCwG5lrLq9biZkxWOiqY&#13;&#10;22YiTra2kYMu1l1tQD30/bPm3wwYN0x18gb45AdQl1tp5j/sFB2T0FQ7R0nTNEV3j6o9feQzro1i&#13;&#10;OWA14Fm+Q8a1a8+Bvu/d/dMb2JY5uiPbhG/ktn4cqGU/er3pcvwCAAD//wMAUEsDBBQABgAIAAAA&#13;&#10;IQADMDmKRwIAAOsEAAAOAAAAZHJzL2Uyb0RvYy54bWysVE1vGjEQvVfqf7B8LwuI0BSxRIgoVSWU&#13;&#10;RCFVzsZrw6pejzs2LPTXd+xdFppyqnoxY8+8+Xj7hundoTJsr9CXYHM+6PU5U1ZCUdpNzr+/Pny6&#13;&#10;5cwHYQthwKqcH5Xnd7OPH6a1m6ghbMEUChklsX5Su5xvQ3CTLPNyqyrhe+CUJacGrESgK26yAkVN&#13;&#10;2SuTDfv9cVYDFg5BKu/p9b5x8lnKr7WS4UlrrwIzOafeQjoxnet4ZrOpmGxQuG0p2zbEP3RRidJS&#13;&#10;0S7VvQiC7bD8K1VVSgQPOvQkVBloXUqVZqBpBv1306y2wqk0C5HjXUeT/39p5eN+5Z6RaKidn3gy&#13;&#10;4xQHjVX8pf7YIZF17MhSh8AkPQ7H1PGAM0mu4c1wdDuOZGZnsEMfviqoWDRyjvQtEkViv/ShCT2F&#13;&#10;EO5cPlnhaFTswNgXpVlZxIIJnZShFgbZXtA3FVIqG06lU3SE6dKYDji4BjRh0PbbxkaYSorpgP1r&#13;&#10;wD8rdohUFWzowFVpAa8lKH50lZv40/TNzHH8NRTHZ2QIjV69kw8lkbgUPjwLJIGSlGnpwhMd2kCd&#13;&#10;c2gtzraAv669x3jSDXk5q0nwOfc/dwIVZ+abJUV9GYxGcUPSZXTzeUgXvPSsLz12Vy2A+CcBUHfJ&#13;&#10;jPHBnEyNUL3Rbs5jVXIJK6l2zmXA02URmkWk7ZZqPk9htBVOhKVdORmTR1ajSF4PbwJdq6RAEnyE&#13;&#10;03KIyTtBNbERaWG+C6DLpLYzry3ftFFJr+32x5W9vKeo83/U7DcAAAD//wMAUEsDBBQABgAIAAAA&#13;&#10;IQDGnnCu3wAAAA0BAAAPAAAAZHJzL2Rvd25yZXYueG1sTI/NTsNADITvSLzDykjc6CY0qmiaTVWo&#13;&#10;Clcof1c3a5KIrDfKbtrw9rgnuFgejTz+plhPrlNHGkLr2UA6S0ARV962XBt4e93d3IEKEdli55kM&#13;&#10;/FCAdXl5UWBu/Ylf6LiPtZIQDjkaaGLsc61D1ZDDMPM9sXhffnAYRQ61tgOeJNx1+jZJFtphy/Kh&#13;&#10;wZ4eGqq+96MzMFaP9591v3ne7ub8pH26dO8f1pjrq2m7krFZgYo0xb8LOHcQfigF7OBHtkF1opNM&#13;&#10;+KOBLAV19rOFLAfR8yXostD/W5S/AAAA//8DAFBLAQItABQABgAIAAAAIQC2gziS/gAAAOEBAAAT&#13;&#10;AAAAAAAAAAAAAAAAAAAAAABbQ29udGVudF9UeXBlc10ueG1sUEsBAi0AFAAGAAgAAAAhADj9If/W&#13;&#10;AAAAlAEAAAsAAAAAAAAAAAAAAAAALwEAAF9yZWxzLy5yZWxzUEsBAi0AFAAGAAgAAAAhAAMwOYpH&#13;&#10;AgAA6wQAAA4AAAAAAAAAAAAAAAAALgIAAGRycy9lMm9Eb2MueG1sUEsBAi0AFAAGAAgAAAAhAMae&#13;&#10;cK7fAAAADQEAAA8AAAAAAAAAAAAAAAAAoQQAAGRycy9kb3ducmV2LnhtbFBLBQYAAAAABAAEAPMA&#13;&#10;AACtBQAAAAA=&#13;&#10;" fillcolor="white [3201]" strokecolor="#4ea72e [3209]" strokeweight="1pt"/>
+                        </w:pict>
+                      </mc:Fallback>
+                    </mc:AlternateContent>
                   </w:r>
                   <w:r>
                     <w:rPr>
@@ -5561,39 +5728,29 @@
                       <w:sz w:val="18"/>
                       <w:szCs w:val="18"/>
                     </w:rPr>
-                    <w:t xml:space="preserve">Units </w:t>
-                  </w:r>
-                </w:p>
-                <w:p>
-                  <w:pPr>
-                    <w:shd w:val="clear" w:color="auto" w:fill="E8E8E8" w:themeFill="background2"/>
-                    <w:ind w:right="126"/>
-                    <w:rPr>
-                      <w:rFonts w:ascii="Arial" w:hAnsi="Arial" w:cs="Arial"/>
+                    <w:t xml:space="preserve">Old </w:t>
+                  </w:r>
+                  <w:r>
+                    <w:rPr>
+                      <w:rFonts w:ascii="Arial" w:hAnsi="Arial" w:cs="Arial"/>
+                      <w:b/>
+                      <w:bCs/>
                       <w:sz w:val="18"/>
                       <w:szCs w:val="18"/>
                     </w:rPr>
-                  </w:pPr>
-                  <w:r>
-                    <w:rPr>
-                      <w:rFonts w:ascii="Arial" w:hAnsi="Arial" w:cs="Arial"/>
-                      <w:b/>
-                      <w:bCs/>
+                    <w:t xml:space="preserve">Units </w:t>
+                  </w:r>
+                </w:p>
+                <w:p>
+                  <w:pPr>
+                    <w:shd w:val="clear" w:color="auto" w:fill="E8E8E8" w:themeFill="background2"/>
+                    <w:ind w:right="126"/>
+                    <w:rPr>
+                      <w:rFonts w:ascii="Arial" w:hAnsi="Arial" w:cs="Arial"/>
                       <w:sz w:val="18"/>
                       <w:szCs w:val="18"/>
                     </w:rPr>
-                    <w:t>Remaining:</w:t>
-                  </w:r>
-                  <w:r>
-                    <w:rPr>
-                      <w:rFonts w:ascii="Arial" w:hAnsi="Arial" w:cs="Arial"/>
-                      <w:b/>
-                      <w:bCs/>
-                      <w:sz w:val="21"/>
-                      <w:szCs w:val="21"/>
-                    </w:rPr>
-                    <w:t xml:space="preserve"> </w:t>
-                  </w:r>
+                  </w:pPr>
                   <w:r>
                     <w:rPr>
                       <w:rFonts w:ascii="Arial" w:hAnsi="Arial" w:cs="Arial"/>
@@ -5602,57 +5759,33 @@
                       <w:sz w:val="18"/>
                       <w:szCs w:val="18"/>
                     </w:rPr>
-                    <w:t>{{Label</w:t>
-                  </w:r>
-                  <w:r>
-                    <w:rPr>
-                      <w:rFonts w:ascii="Arial" w:hAnsi="Arial" w:cs="Arial"/>
-                      <w:b/>
-                      <w:bCs/>
+                    <w:t>Remaining:</w:t>
+                  </w:r>
+                  <w:r>
+                    <w:rPr>
+                      <w:rFonts w:ascii="Arial" w:hAnsi="Arial" w:cs="Arial"/>
+                      <w:noProof/>
                       <w:sz w:val="18"/>
                       <w:szCs w:val="18"/>
                     </w:rPr>
-                    <w:t>3</w:t>
-                  </w:r>
-                  <w:r>
-                    <w:rPr>
-                      <w:rFonts w:ascii="Arial" w:hAnsi="Arial" w:cs="Arial"/>
-                      <w:b/>
-                      <w:bCs/>
+                    <w:t xml:space="preserve"> </w:t>
+                  </w:r>
+                  <w:r>
+                    <w:rPr>
+                      <w:rFonts w:ascii="Arial" w:hAnsi="Arial" w:cs="Arial"/>
                       <w:sz w:val="18"/>
                       <w:szCs w:val="18"/>
                     </w:rPr>
-                    <w:t>.POS</w:t>
-                  </w:r>
-                  <w:proofErr w:type="gramStart"/>
-                  <w:r>
-                    <w:rPr>
-                      <w:rFonts w:ascii="Arial" w:hAnsi="Arial" w:cs="Arial"/>
-                      <w:b/>
-                      <w:bCs/>
+                    <w:t xml:space="preserve"> </w:t>
+                  </w:r>
+                  <w:r>
+                    <w:rPr>
+                      <w:rFonts w:ascii="Arial" w:hAnsi="Arial" w:cs="Arial"/>
                       <w:sz w:val="18"/>
                       <w:szCs w:val="18"/>
                     </w:rPr>
-                    <w:t>}}</w:t>
-                  </w:r>
-                  <w:r>
-                    <w:rPr>
-                      <w:rFonts w:ascii="Arial" w:hAnsi="Arial" w:cs="Arial"/>
-                      <w:noProof/>
-                      <w:sz w:val="15"/>
-                      <w:szCs w:val="15"/>
-                    </w:rPr>
                     <w:t xml:space="preserve"> </w:t>
                   </w:r>
-                  <w:r>
-                    <w:rPr>
-                      <w:rFonts w:ascii="Arial" w:hAnsi="Arial" w:cs="Arial"/>
-                      <w:sz w:val="15"/>
-                      <w:szCs w:val="15"/>
-                    </w:rPr>
-                    <w:t xml:space="preserve">  </w:t>
-                  </w:r>
-                  <w:proofErr w:type="gramEnd"/>
                   <w:r>
                     <w:rPr>
                       <w:rFonts w:ascii="Arial" w:hAnsi="Arial" w:cs="Arial"/>
@@ -8212,58 +8345,87 @@
                       <w:rFonts w:ascii="Arial" w:hAnsi="Arial" w:cs="Arial"/>
                       <w:b/>
                       <w:bCs/>
-                      <w:sz w:val="18"/>
-                      <w:szCs w:val="18"/>
-                    </w:rPr>
-                    <w:t xml:space="preserve">Old </w:t>
-                  </w:r>
-                  <w:r>
-                    <w:rPr>
-                      <w:rFonts w:ascii="Arial" w:hAnsi="Arial" w:cs="Arial"/>
-                      <w:b/>
-                      <w:bCs/>
-                      <w:sz w:val="18"/>
-                      <w:szCs w:val="18"/>
-                    </w:rPr>
-                    <w:t xml:space="preserve">Units </w:t>
-                  </w:r>
-                </w:p>
-                <w:p>
-                  <w:pPr>
-                    <w:shd w:val="clear" w:color="auto" w:fill="E8E8E8" w:themeFill="background2"/>
-                    <w:ind w:right="126"/>
-                    <w:rPr>
-                      <w:rFonts w:ascii="Arial" w:hAnsi="Arial" w:cs="Arial"/>
-                      <w:sz w:val="18"/>
-                      <w:szCs w:val="18"/>
-                    </w:rPr>
-                  </w:pPr>
-                  <w:r>
-                    <w:rPr>
-                      <w:rFonts w:ascii="Arial" w:hAnsi="Arial" w:cs="Arial"/>
-                      <w:b/>
-                      <w:bCs/>
-                      <w:sz w:val="18"/>
-                      <w:szCs w:val="18"/>
-                    </w:rPr>
-                    <w:t>Remaining:</w:t>
-                  </w:r>
-                  <w:r>
-                    <w:rPr>
-                      <w:rFonts w:ascii="Arial" w:hAnsi="Arial" w:cs="Arial"/>
                       <w:noProof/>
                       <w:sz w:val="18"/>
                       <w:szCs w:val="18"/>
                     </w:rPr>
-                    <w:t xml:space="preserve"> </w:t>
-                  </w:r>
-                  <w:r>
-                    <w:rPr>
-                      <w:rFonts w:ascii="Arial" w:hAnsi="Arial" w:cs="Arial"/>
+                    <mc:AlternateContent>
+                      <mc:Choice Requires="wps">
+                        <w:drawing>
+                          <wp:anchor distT="0" distB="0" distL="114300" distR="114300" simplePos="0" relativeHeight="251714560" behindDoc="0" locked="0" layoutInCell="1" allowOverlap="1" wp14:anchorId="4A94B686" wp14:editId="462B0002">
+                            <wp:simplePos x="0" y="0"/>
+                            <wp:positionH relativeFrom="column">
+                              <wp:posOffset>665723</wp:posOffset>
+                            </wp:positionH>
+                            <wp:positionV relativeFrom="paragraph">
+                              <wp:posOffset>26279</wp:posOffset>
+                            </wp:positionV>
+                            <wp:extent cx="262011" cy="252486"/>
+                            <wp:effectExtent l="0" t="0" r="17780" b="14605"/>
+                            <wp:wrapNone/>
+                            <wp:docPr id="213564599" name="Rectangle 1"/>
+                            <wp:cNvGraphicFramePr/>
+                            <a:graphic xmlns:a="http://schemas.openxmlformats.org/drawingml/2006/main">
+                              <a:graphicData uri="http://schemas.microsoft.com/office/word/2010/wordprocessingShape">
+                                <wps:wsp>
+                                  <wps:cNvSpPr/>
+                                  <wps:spPr>
+                                    <a:xfrm>
+                                      <a:off x="0" y="0"/>
+                                      <a:ext cx="262011" cy="252486"/>
+                                    </a:xfrm>
+                                    <a:prstGeom prst="rect">
+                                      <a:avLst/>
+                                    </a:prstGeom>
+                                  </wps:spPr>
+                                  <wps:style>
+                                    <a:lnRef idx="2">
+                                      <a:schemeClr val="accent6"/>
+                                    </a:lnRef>
+                                    <a:fillRef idx="1">
+                                      <a:schemeClr val="lt1"/>
+                                    </a:fillRef>
+                                    <a:effectRef idx="0">
+                                      <a:schemeClr val="accent6"/>
+                                    </a:effectRef>
+                                    <a:fontRef idx="minor">
+                                      <a:schemeClr val="dk1"/>
+                                    </a:fontRef>
+                                  </wps:style>
+                                  <wps:bodyPr rot="0" spcFirstLastPara="0" vertOverflow="overflow" horzOverflow="overflow" vert="horz" wrap="square" lIns="91440" tIns="45720" rIns="91440" bIns="45720" numCol="1" spcCol="0" rtlCol="0" fromWordArt="0" anchor="ctr" anchorCtr="0" forceAA="0" compatLnSpc="1">
+                                    <a:prstTxWarp prst="textNoShape">
+                                      <a:avLst/>
+                                    </a:prstTxWarp>
+                                    <a:noAutofit/>
+                                  </wps:bodyPr>
+                                </wps:wsp>
+                              </a:graphicData>
+                            </a:graphic>
+                            <wp14:sizeRelH relativeFrom="margin">
+                              <wp14:pctWidth>0</wp14:pctWidth>
+                            </wp14:sizeRelH>
+                            <wp14:sizeRelV relativeFrom="margin">
+                              <wp14:pctHeight>0</wp14:pctHeight>
+                            </wp14:sizeRelV>
+                          </wp:anchor>
+                        </w:drawing>
+                      </mc:Choice>
+                      <mc:Fallback>
+                        <w:pict>
+                          <v:rect w14:anchorId="075919FC" id="Rectangle 1" o:spid="_x0000_s1026" style="position:absolute;margin-left:52.4pt;margin-top:2.05pt;width:20.65pt;height:19.9pt;z-index:251714560;visibility:visible;mso-wrap-style:square;mso-width-percent:0;mso-height-percent:0;mso-wrap-distance-left:9pt;mso-wrap-distance-top:0;mso-wrap-distance-right:9pt;mso-wrap-distance-bottom:0;mso-position-horizontal:absolute;mso-position-horizontal-relative:text;mso-position-vertical:absolute;mso-position-vertical-relative:text;mso-width-percent:0;mso-height-percent:0;mso-width-relative:margin;mso-height-relative:margin;v-text-anchor:middle" o:gfxdata="UEsDBBQABgAIAAAAIQC2gziS/gAAAOEBAAATAAAAW0NvbnRlbnRfVHlwZXNdLnhtbJSRQU7DMBBF&#13;&#10;90jcwfIWJU67QAgl6YK0S0CoHGBkTxKLZGx5TGhvj5O2G0SRWNoz/78nu9wcxkFMGNg6quQqL6RA&#13;&#10;0s5Y6ir5vt9lD1JwBDIwOMJKHpHlpr69KfdHjyxSmriSfYz+USnWPY7AufNIadK6MEJMx9ApD/oD&#13;&#10;OlTrorhX2lFEilmcO2RdNtjC5xDF9pCuTyYBB5bi6bQ4syoJ3g9WQ0ymaiLzg5KdCXlKLjvcW893&#13;&#10;SUOqXwnz5DrgnHtJTxOsQfEKIT7DmDSUCaxw7Rqn8787ZsmRM9e2VmPeBN4uqYvTtW7jvijg9N/y&#13;&#10;JsXecLq0q+WD6m8AAAD//wMAUEsDBBQABgAIAAAAIQA4/SH/1gAAAJQBAAALAAAAX3JlbHMvLnJl&#13;&#10;bHOkkMFqwzAMhu+DvYPRfXGawxijTi+j0GvpHsDYimMaW0Yy2fr2M4PBMnrbUb/Q94l/f/hMi1qR&#13;&#10;JVI2sOt6UJgd+ZiDgffL8ekFlFSbvV0oo4EbChzGx4f9GRdb25HMsYhqlCwG5lrLq9biZkxWOiqY&#13;&#10;22YiTra2kYMu1l1tQD30/bPm3wwYN0x18gb45AdQl1tp5j/sFB2T0FQ7R0nTNEV3j6o9feQzro1i&#13;&#10;OWA14Fm+Q8a1a8+Bvu/d/dMb2JY5uiPbhG/ktn4cqGU/er3pcvwCAAD//wMAUEsDBBQABgAIAAAA&#13;&#10;IQADMDmKRwIAAOsEAAAOAAAAZHJzL2Uyb0RvYy54bWysVE1vGjEQvVfqf7B8LwuI0BSxRIgoVSWU&#13;&#10;RCFVzsZrw6pejzs2LPTXd+xdFppyqnoxY8+8+Xj7hundoTJsr9CXYHM+6PU5U1ZCUdpNzr+/Pny6&#13;&#10;5cwHYQthwKqcH5Xnd7OPH6a1m6ghbMEUChklsX5Su5xvQ3CTLPNyqyrhe+CUJacGrESgK26yAkVN&#13;&#10;2SuTDfv9cVYDFg5BKu/p9b5x8lnKr7WS4UlrrwIzOafeQjoxnet4ZrOpmGxQuG0p2zbEP3RRidJS&#13;&#10;0S7VvQiC7bD8K1VVSgQPOvQkVBloXUqVZqBpBv1306y2wqk0C5HjXUeT/39p5eN+5Z6RaKidn3gy&#13;&#10;4xQHjVX8pf7YIZF17MhSh8AkPQ7H1PGAM0mu4c1wdDuOZGZnsEMfviqoWDRyjvQtEkViv/ShCT2F&#13;&#10;EO5cPlnhaFTswNgXpVlZxIIJnZShFgbZXtA3FVIqG06lU3SE6dKYDji4BjRh0PbbxkaYSorpgP1r&#13;&#10;wD8rdohUFWzowFVpAa8lKH50lZv40/TNzHH8NRTHZ2QIjV69kw8lkbgUPjwLJIGSlGnpwhMd2kCd&#13;&#10;c2gtzraAv669x3jSDXk5q0nwOfc/dwIVZ+abJUV9GYxGcUPSZXTzeUgXvPSsLz12Vy2A+CcBUHfJ&#13;&#10;jPHBnEyNUL3Rbs5jVXIJK6l2zmXA02URmkWk7ZZqPk9htBVOhKVdORmTR1ajSF4PbwJdq6RAEnyE&#13;&#10;03KIyTtBNbERaWG+C6DLpLYzry3ftFFJr+32x5W9vKeo83/U7DcAAAD//wMAUEsDBBQABgAIAAAA&#13;&#10;IQDGnnCu3wAAAA0BAAAPAAAAZHJzL2Rvd25yZXYueG1sTI/NTsNADITvSLzDykjc6CY0qmiaTVWo&#13;&#10;Clcof1c3a5KIrDfKbtrw9rgnuFgejTz+plhPrlNHGkLr2UA6S0ARV962XBt4e93d3IEKEdli55kM&#13;&#10;/FCAdXl5UWBu/Ylf6LiPtZIQDjkaaGLsc61D1ZDDMPM9sXhffnAYRQ61tgOeJNx1+jZJFtphy/Kh&#13;&#10;wZ4eGqq+96MzMFaP9591v3ne7ub8pH26dO8f1pjrq2m7krFZgYo0xb8LOHcQfigF7OBHtkF1opNM&#13;&#10;+KOBLAV19rOFLAfR8yXostD/W5S/AAAA//8DAFBLAQItABQABgAIAAAAIQC2gziS/gAAAOEBAAAT&#13;&#10;AAAAAAAAAAAAAAAAAAAAAABbQ29udGVudF9UeXBlc10ueG1sUEsBAi0AFAAGAAgAAAAhADj9If/W&#13;&#10;AAAAlAEAAAsAAAAAAAAAAAAAAAAALwEAAF9yZWxzLy5yZWxzUEsBAi0AFAAGAAgAAAAhAAMwOYpH&#13;&#10;AgAA6wQAAA4AAAAAAAAAAAAAAAAALgIAAGRycy9lMm9Eb2MueG1sUEsBAi0AFAAGAAgAAAAhAMae&#13;&#10;cK7fAAAADQEAAA8AAAAAAAAAAAAAAAAAoQQAAGRycy9kb3ducmV2LnhtbFBLBQYAAAAABAAEAPMA&#13;&#10;AACtBQAAAAA=&#13;&#10;" fillcolor="white [3201]" strokecolor="#4ea72e [3209]" strokeweight="1pt"/>
+                        </w:pict>
+                      </mc:Fallback>
+                    </mc:AlternateContent>
+                  </w:r>
+                  <w:r>
+                    <w:rPr>
+                      <w:rFonts w:ascii="Arial" w:hAnsi="Arial" w:cs="Arial"/>
+                      <w:b/>
+                      <w:bCs/>
                       <w:sz w:val="18"/>
                       <w:szCs w:val="18"/>
                     </w:rPr>
-                    <w:t xml:space="preserve"> </w:t>
+                    <w:t xml:space="preserve">Old </w:t>
                   </w:r>
                   <w:r>
                     <w:rPr>
@@ -8273,18 +8435,19 @@
                       <w:sz w:val="18"/>
                       <w:szCs w:val="18"/>
                     </w:rPr>
-                    <w:t>{{Label</w:t>
-                  </w:r>
-                  <w:r>
-                    <w:rPr>
-                      <w:rFonts w:ascii="Arial" w:hAnsi="Arial" w:cs="Arial"/>
-                      <w:b/>
-                      <w:bCs/>
+                    <w:t xml:space="preserve">Units </w:t>
+                  </w:r>
+                </w:p>
+                <w:p>
+                  <w:pPr>
+                    <w:shd w:val="clear" w:color="auto" w:fill="E8E8E8" w:themeFill="background2"/>
+                    <w:ind w:right="126"/>
+                    <w:rPr>
+                      <w:rFonts w:ascii="Arial" w:hAnsi="Arial" w:cs="Arial"/>
                       <w:sz w:val="18"/>
                       <w:szCs w:val="18"/>
                     </w:rPr>
-                    <w:t>4</w:t>
-                  </w:r>
+                  </w:pPr>
                   <w:r>
                     <w:rPr>
                       <w:rFonts w:ascii="Arial" w:hAnsi="Arial" w:cs="Arial"/>
@@ -8293,7 +8456,24 @@
                       <w:sz w:val="18"/>
                       <w:szCs w:val="18"/>
                     </w:rPr>
-                    <w:t>.POS}}</w:t>
+                    <w:t>Remaining:</w:t>
+                  </w:r>
+                  <w:r>
+                    <w:rPr>
+                      <w:rFonts w:ascii="Arial" w:hAnsi="Arial" w:cs="Arial"/>
+                      <w:noProof/>
+                      <w:sz w:val="18"/>
+                      <w:szCs w:val="18"/>
+                    </w:rPr>
+                    <w:t xml:space="preserve"> </w:t>
+                  </w:r>
+                  <w:r>
+                    <w:rPr>
+                      <w:rFonts w:ascii="Arial" w:hAnsi="Arial" w:cs="Arial"/>
+                      <w:sz w:val="18"/>
+                      <w:szCs w:val="18"/>
+                    </w:rPr>
+                    <w:t xml:space="preserve"> </w:t>
                   </w:r>
                   <w:r>
                     <w:rPr>
@@ -8629,7 +8809,27 @@
                       <w:sz w:val="16"/>
                       <w:szCs w:val="16"/>
                     </w:rPr>
-                    <w:t>{{Label4.QuantityReceived}}</w:t>
+                    <w:t>{{Label</w:t>
+                  </w:r>
+                  <w:r>
+                    <w:rPr>
+                      <w:rFonts w:ascii="Arial" w:hAnsi="Arial" w:cs="Arial"/>
+                      <w:b/>
+                      <w:bCs/>
+                      <w:sz w:val="16"/>
+                      <w:szCs w:val="16"/>
+                    </w:rPr>
+                    <w:t>4</w:t>
+                  </w:r>
+                  <w:r>
+                    <w:rPr>
+                      <w:rFonts w:ascii="Arial" w:hAnsi="Arial" w:cs="Arial"/>
+                      <w:b/>
+                      <w:bCs/>
+                      <w:sz w:val="16"/>
+                      <w:szCs w:val="16"/>
+                    </w:rPr>
+                    <w:t>.QuantityReceived}}</w:t>
                   </w:r>
                 </w:p>
                 <w:p>

</xml_diff>